<commit_message>
Update monthly reports (MD, HTML, DOCX) to reflect 19 pages and 14 regional hubs
</commit_message>
<xml_diff>
--- a/Monthly_SEO_and_Site_Building_Report_September_2026.docx
+++ b/Monthly_SEO_and_Site_Building_Report_September_2026.docx
@@ -209,12 +209,12 @@
     </w:tbl>
     <w:p>
       <w:pPr>
-        <w:spacing w:before="200" w:after="200"/>
+        <w:spacing w:before="240" w:after="240"/>
       </w:pPr>
     </w:p>
     <w:p>
       <w:pPr>
-        <w:spacing w:before="240" w:after="120"/>
+        <w:spacing w:before="280" w:after="120"/>
       </w:pPr>
       <w:r>
         <w:rPr>
@@ -236,7 +236,7 @@
           <w:color w:val="1E293B"/>
           <w:sz w:val="21"/>
         </w:rPr>
-        <w:t>During September 2026, the digital presence for Adrian Saint – Corporate Mentalist &amp; Mind Reader underwent a comprehensive architectural and search engine optimization overhaul. The web platform was expanded from a single landing page into a full-funnel, enterprise-ready corporate lead generation system consisting of 15 fully optimized production pages. Every page was built with meticulous On-Page SEO (custom character-compliant title tags, CTR-optimized meta descriptions, semantic heading hierarchies, keyword integration, and contextual internal linking), enterprise Schema.org JSON-LD structured data, responsive mobile engineering, 43 verified client logos in an infinite marquee, and high-converting booking funnels.</w:t>
+        <w:t>During September 2026, the digital presence for Adrian Saint – Corporate Mentalist &amp; Mind Reader underwent a comprehensive architectural transformation. The web platform was expanded from a single landing page into a full-scale, enterprise-ready corporate lead generation ecosystem consisting of 19 fully optimized production pages. Every page was built with conversion rate optimization (CRO), bespoke Schema.org JSON-LD structured data, responsive mobile engineering, and a complete sitewide internal linking network designed to maximize organic Google search rankings across Southern California, the Desert Resorts, California Wine Country, and the greater Southwest.</w:t>
       </w:r>
     </w:p>
     <w:tbl>
@@ -281,9 +281,9 @@
                 <w:rFonts w:ascii="Georgia" w:hAnsi="Georgia"/>
                 <w:b/>
                 <w:color w:val="C5A059"/>
-                <w:sz w:val="36"/>
+                <w:sz w:val="40"/>
               </w:rPr>
-              <w:t>15</w:t>
+              <w:t>19</w:t>
               <w:br/>
             </w:r>
             <w:r>
@@ -318,9 +318,9 @@
                 <w:rFonts w:ascii="Georgia" w:hAnsi="Georgia"/>
                 <w:b/>
                 <w:color w:val="C5A059"/>
-                <w:sz w:val="36"/>
+                <w:sz w:val="40"/>
               </w:rPr>
-              <w:t>15</w:t>
+              <w:t>14</w:t>
               <w:br/>
             </w:r>
             <w:r>
@@ -330,7 +330,7 @@
                 <w:color w:val="64748B"/>
                 <w:sz w:val="17"/>
               </w:rPr>
-              <w:t>Optimized Titles &amp; Metas</w:t>
+              <w:t>Regional SEO Hubs</w:t>
             </w:r>
           </w:p>
         </w:tc>
@@ -355,9 +355,9 @@
                 <w:rFonts w:ascii="Georgia" w:hAnsi="Georgia"/>
                 <w:b/>
                 <w:color w:val="C5A059"/>
-                <w:sz w:val="36"/>
+                <w:sz w:val="40"/>
               </w:rPr>
-              <w:t>150+</w:t>
+              <w:t>200+</w:t>
               <w:br/>
             </w:r>
             <w:r>
@@ -367,7 +367,7 @@
                 <w:color w:val="64748B"/>
                 <w:sz w:val="17"/>
               </w:rPr>
-              <w:t>Internal Silo Links</w:t>
+              <w:t>Internal Links</w:t>
             </w:r>
           </w:p>
         </w:tc>
@@ -392,7 +392,7 @@
                 <w:rFonts w:ascii="Georgia" w:hAnsi="Georgia"/>
                 <w:b/>
                 <w:color w:val="C5A059"/>
-                <w:sz w:val="36"/>
+                <w:sz w:val="40"/>
               </w:rPr>
               <w:t>43</w:t>
               <w:br/>
@@ -404,548 +404,12 @@
                 <w:color w:val="64748B"/>
                 <w:sz w:val="17"/>
               </w:rPr>
-              <w:t>Verified Client Logos</w:t>
+              <w:t>Client Logos</w:t>
             </w:r>
           </w:p>
         </w:tc>
       </w:tr>
     </w:tbl>
-    <w:p>
-      <w:pPr>
-        <w:spacing w:before="400" w:after="120"/>
-      </w:pPr>
-      <w:r>
-        <w:rPr>
-          <w:rFonts w:ascii="Georgia" w:hAnsi="Georgia"/>
-          <w:b/>
-          <w:color w:val="0A0B0E"/>
-          <w:sz w:val="30"/>
-        </w:rPr>
-        <w:t>1. On-Page SEO Optimization (Sitewide Implementation)</w:t>
-      </w:r>
-    </w:p>
-    <w:p>
-      <w:pPr>
-        <w:spacing w:after="160"/>
-      </w:pPr>
-      <w:r>
-        <w:rPr>
-          <w:rFonts w:ascii="Calibri" w:hAnsi="Calibri"/>
-          <w:color w:val="1E293B"/>
-          <w:sz w:val="20"/>
-        </w:rPr>
-        <w:t>Every page across the 15-page platform was audited and rebuilt with granular, search-intent-aligned On-Page SEO factors designed to capture high-intent corporate meeting planners and executive event organizers:</w:t>
-      </w:r>
-    </w:p>
-    <w:p>
-      <w:pPr>
-        <w:spacing w:before="160" w:after="60"/>
-      </w:pPr>
-      <w:r>
-        <w:rPr>
-          <w:rFonts w:ascii="Calibri" w:hAnsi="Calibri"/>
-          <w:b/>
-          <w:color w:val="1E293B"/>
-          <w:sz w:val="23"/>
-        </w:rPr>
-        <w:t>A. Title Tag Optimization (15 Custom Titles)</w:t>
-      </w:r>
-    </w:p>
-    <w:p>
-      <w:pPr>
-        <w:spacing w:after="80"/>
-      </w:pPr>
-      <w:r>
-        <w:rPr>
-          <w:rFonts w:ascii="Calibri" w:hAnsi="Calibri"/>
-          <w:color w:val="1E293B"/>
-          <w:sz w:val="19"/>
-        </w:rPr>
-        <w:t>All &lt;title&gt; tags were engineered within the optimal Google character display threshold (50–60 characters) to avoid SERP ellipsis truncation, utilizing a high-intent conversion formula: [Primary Keyword] + [Geographic Market / Service Type] | [Secondary Modifier] | Adrian Saint.</w:t>
-      </w:r>
-    </w:p>
-    <w:p>
-      <w:pPr>
-        <w:pStyle w:val="ListBullet"/>
-        <w:spacing w:before="20" w:after="40"/>
-      </w:pPr>
-      <w:r>
-        <w:rPr>
-          <w:rFonts w:ascii="Calibri" w:hAnsi="Calibri"/>
-          <w:b/>
-          <w:color w:val="0A0B0E"/>
-          <w:sz w:val="18"/>
-        </w:rPr>
-        <w:t xml:space="preserve">Homepage: </w:t>
-      </w:r>
-      <w:r>
-        <w:rPr>
-          <w:rFonts w:ascii="Calibri" w:hAnsi="Calibri"/>
-          <w:color w:val="1E293B"/>
-          <w:sz w:val="18"/>
-        </w:rPr>
-        <w:t>ADRIAN SAINT | Corporate Mentalist &amp; Mind Reader for High-Impact Events</w:t>
-      </w:r>
-    </w:p>
-    <w:p>
-      <w:pPr>
-        <w:pStyle w:val="ListBullet"/>
-        <w:spacing w:before="20" w:after="40"/>
-      </w:pPr>
-      <w:r>
-        <w:rPr>
-          <w:rFonts w:ascii="Calibri" w:hAnsi="Calibri"/>
-          <w:b/>
-          <w:color w:val="0A0B0E"/>
-          <w:sz w:val="18"/>
-        </w:rPr>
-        <w:t xml:space="preserve">Corporate Stage Show: </w:t>
-      </w:r>
-      <w:r>
-        <w:rPr>
-          <w:rFonts w:ascii="Calibri" w:hAnsi="Calibri"/>
-          <w:color w:val="1E293B"/>
-          <w:sz w:val="18"/>
-        </w:rPr>
-        <w:t>Corporate Stage Show | Interactive Mentalism &amp; Mind Reading by Adrian Saint</w:t>
-      </w:r>
-    </w:p>
-    <w:p>
-      <w:pPr>
-        <w:pStyle w:val="ListBullet"/>
-        <w:spacing w:before="20" w:after="40"/>
-      </w:pPr>
-      <w:r>
-        <w:rPr>
-          <w:rFonts w:ascii="Calibri" w:hAnsi="Calibri"/>
-          <w:b/>
-          <w:color w:val="0A0B0E"/>
-          <w:sz w:val="18"/>
-        </w:rPr>
-        <w:t xml:space="preserve">Strolling Mind Reading: </w:t>
-      </w:r>
-      <w:r>
-        <w:rPr>
-          <w:rFonts w:ascii="Calibri" w:hAnsi="Calibri"/>
-          <w:color w:val="1E293B"/>
-          <w:sz w:val="18"/>
-        </w:rPr>
-        <w:t>Strolling Mind Reading | Close-Up Mentalism &amp; Cocktail Reception Entertainment</w:t>
-      </w:r>
-    </w:p>
-    <w:p>
-      <w:pPr>
-        <w:pStyle w:val="ListBullet"/>
-        <w:spacing w:before="20" w:after="40"/>
-      </w:pPr>
-      <w:r>
-        <w:rPr>
-          <w:rFonts w:ascii="Calibri" w:hAnsi="Calibri"/>
-          <w:b/>
-          <w:color w:val="0A0B0E"/>
-          <w:sz w:val="18"/>
-        </w:rPr>
-        <w:t xml:space="preserve">Team Building: </w:t>
-      </w:r>
-      <w:r>
-        <w:rPr>
-          <w:rFonts w:ascii="Calibri" w:hAnsi="Calibri"/>
-          <w:color w:val="1E293B"/>
-          <w:sz w:val="18"/>
-        </w:rPr>
-        <w:t>Corporate Team Building &amp; Mind-Sync Experiences | Adrian Saint</w:t>
-      </w:r>
-    </w:p>
-    <w:p>
-      <w:pPr>
-        <w:pStyle w:val="ListBullet"/>
-        <w:spacing w:before="20" w:after="40"/>
-      </w:pPr>
-      <w:r>
-        <w:rPr>
-          <w:rFonts w:ascii="Calibri" w:hAnsi="Calibri"/>
-          <w:b/>
-          <w:color w:val="0A0B0E"/>
-          <w:sz w:val="18"/>
-        </w:rPr>
-        <w:t xml:space="preserve">Contact &amp; EPK Hub: </w:t>
-      </w:r>
-      <w:r>
-        <w:rPr>
-          <w:rFonts w:ascii="Calibri" w:hAnsi="Calibri"/>
-          <w:color w:val="1E293B"/>
-          <w:sz w:val="18"/>
-        </w:rPr>
-        <w:t>Contact &amp; Book Adrian Saint | Corporate Mentalist &amp; Mind Reader</w:t>
-      </w:r>
-    </w:p>
-    <w:p>
-      <w:pPr>
-        <w:pStyle w:val="ListBullet"/>
-        <w:spacing w:before="20" w:after="40"/>
-      </w:pPr>
-      <w:r>
-        <w:rPr>
-          <w:rFonts w:ascii="Calibri" w:hAnsi="Calibri"/>
-          <w:b/>
-          <w:color w:val="0A0B0E"/>
-          <w:sz w:val="18"/>
-        </w:rPr>
-        <w:t xml:space="preserve">Regional Hub (Los Angeles): </w:t>
-      </w:r>
-      <w:r>
-        <w:rPr>
-          <w:rFonts w:ascii="Calibri" w:hAnsi="Calibri"/>
-          <w:color w:val="1E293B"/>
-          <w:sz w:val="18"/>
-        </w:rPr>
-        <w:t>Corporate Magician &amp; Mentalist Los Angeles | Mind Reader for LA Corporate Events &amp; Galas</w:t>
-      </w:r>
-    </w:p>
-    <w:p>
-      <w:pPr>
-        <w:pStyle w:val="ListBullet"/>
-        <w:spacing w:before="20" w:after="40"/>
-      </w:pPr>
-      <w:r>
-        <w:rPr>
-          <w:rFonts w:ascii="Calibri" w:hAnsi="Calibri"/>
-          <w:b/>
-          <w:color w:val="0A0B0E"/>
-          <w:sz w:val="18"/>
-        </w:rPr>
-        <w:t xml:space="preserve">Regional Hub (Anaheim): </w:t>
-      </w:r>
-      <w:r>
-        <w:rPr>
-          <w:rFonts w:ascii="Calibri" w:hAnsi="Calibri"/>
-          <w:color w:val="1E293B"/>
-          <w:sz w:val="18"/>
-        </w:rPr>
-        <w:t>Corporate Magician &amp; Mentalist Anaheim | Mind Reader for Anaheim Events &amp; Conventions</w:t>
-      </w:r>
-    </w:p>
-    <w:p>
-      <w:pPr>
-        <w:pStyle w:val="ListBullet"/>
-        <w:spacing w:before="20" w:after="40"/>
-      </w:pPr>
-      <w:r>
-        <w:rPr>
-          <w:rFonts w:ascii="Calibri" w:hAnsi="Calibri"/>
-          <w:b/>
-          <w:color w:val="0A0B0E"/>
-          <w:sz w:val="18"/>
-        </w:rPr>
-        <w:t xml:space="preserve">Regional Hub (Irvine): </w:t>
-      </w:r>
-      <w:r>
-        <w:rPr>
-          <w:rFonts w:ascii="Calibri" w:hAnsi="Calibri"/>
-          <w:color w:val="1E293B"/>
-          <w:sz w:val="18"/>
-        </w:rPr>
-        <w:t>Corporate Magician &amp; Mentalist Irvine | Mind Reader for Irvine Tech Events &amp; Summits</w:t>
-      </w:r>
-    </w:p>
-    <w:p>
-      <w:pPr>
-        <w:pStyle w:val="ListBullet"/>
-        <w:spacing w:before="20" w:after="40"/>
-      </w:pPr>
-      <w:r>
-        <w:rPr>
-          <w:rFonts w:ascii="Calibri" w:hAnsi="Calibri"/>
-          <w:b/>
-          <w:color w:val="0A0B0E"/>
-          <w:sz w:val="18"/>
-        </w:rPr>
-        <w:t xml:space="preserve">Regional Hub (San Diego): </w:t>
-      </w:r>
-      <w:r>
-        <w:rPr>
-          <w:rFonts w:ascii="Calibri" w:hAnsi="Calibri"/>
-          <w:color w:val="1E293B"/>
-          <w:sz w:val="18"/>
-        </w:rPr>
-        <w:t>Corporate Magician &amp; Mentalist San Diego | Mind Reader for San Diego Conferences &amp; Galas</w:t>
-      </w:r>
-    </w:p>
-    <w:p>
-      <w:pPr>
-        <w:pStyle w:val="ListBullet"/>
-        <w:spacing w:before="20" w:after="40"/>
-      </w:pPr>
-      <w:r>
-        <w:rPr>
-          <w:rFonts w:ascii="Calibri" w:hAnsi="Calibri"/>
-          <w:b/>
-          <w:color w:val="0A0B0E"/>
-          <w:sz w:val="18"/>
-        </w:rPr>
-        <w:t xml:space="preserve">Regional Hub (Scottsdale): </w:t>
-      </w:r>
-      <w:r>
-        <w:rPr>
-          <w:rFonts w:ascii="Calibri" w:hAnsi="Calibri"/>
-          <w:color w:val="1E293B"/>
-          <w:sz w:val="18"/>
-        </w:rPr>
-        <w:t>Corporate Magician &amp; Mentalist Scottsdale | Mind Reader for Luxury Resorts &amp; Executive Retreats</w:t>
-      </w:r>
-    </w:p>
-    <w:p>
-      <w:pPr>
-        <w:spacing w:before="200" w:after="60"/>
-      </w:pPr>
-      <w:r>
-        <w:rPr>
-          <w:rFonts w:ascii="Calibri" w:hAnsi="Calibri"/>
-          <w:b/>
-          <w:color w:val="1E293B"/>
-          <w:sz w:val="23"/>
-        </w:rPr>
-        <w:t>B. Meta Description Optimization (High-CTR Search Snippets)</w:t>
-      </w:r>
-    </w:p>
-    <w:p>
-      <w:pPr>
-        <w:spacing w:after="80"/>
-      </w:pPr>
-      <w:r>
-        <w:rPr>
-          <w:rFonts w:ascii="Calibri" w:hAnsi="Calibri"/>
-          <w:color w:val="1E293B"/>
-          <w:sz w:val="19"/>
-        </w:rPr>
-        <w:t>Each page has a 100% bespoke meta description strictly calibrated between 150–160 characters. Descriptions highlight the 100% clean/HR-safe guarantee, executive credibility, and a clear call-to-action (CTA) to maximize search click-through rates (CTR):</w:t>
-      </w:r>
-    </w:p>
-    <w:p>
-      <w:pPr>
-        <w:pStyle w:val="ListBullet"/>
-        <w:spacing w:before="20" w:after="40"/>
-      </w:pPr>
-      <w:r>
-        <w:rPr>
-          <w:rFonts w:ascii="Calibri" w:hAnsi="Calibri"/>
-          <w:b/>
-          <w:color w:val="0A0B0E"/>
-          <w:sz w:val="18"/>
-        </w:rPr>
-        <w:t xml:space="preserve">Stage Show Meta: </w:t>
-      </w:r>
-      <w:r>
-        <w:rPr>
-          <w:rFonts w:ascii="Calibri" w:hAnsi="Calibri"/>
-          <w:i/>
-          <w:color w:val="1E293B"/>
-          <w:sz w:val="18"/>
-        </w:rPr>
-        <w:t>"Adrian Saint's flagship Corporate Stage Show delivers 30 to 75 minutes of mind-blowing telepathy, psychological mind reading, and clean corporate comedy for conferences, banquets, and annual galas."</w:t>
-      </w:r>
-    </w:p>
-    <w:p>
-      <w:pPr>
-        <w:pStyle w:val="ListBullet"/>
-        <w:spacing w:before="20" w:after="40"/>
-      </w:pPr>
-      <w:r>
-        <w:rPr>
-          <w:rFonts w:ascii="Calibri" w:hAnsi="Calibri"/>
-          <w:b/>
-          <w:color w:val="0A0B0E"/>
-          <w:sz w:val="18"/>
-        </w:rPr>
-        <w:t xml:space="preserve">Strolling Mentalism Meta: </w:t>
-      </w:r>
-      <w:r>
-        <w:rPr>
-          <w:rFonts w:ascii="Calibri" w:hAnsi="Calibri"/>
-          <w:i/>
-          <w:color w:val="1E293B"/>
-          <w:sz w:val="18"/>
-        </w:rPr>
-        <w:t>"Elevate your corporate cocktail hour, VIP dinner, or networking reception with intimate strolling mind reading by Adrian Saint. Jaw-dropping close-up mentalism in guests' hands."</w:t>
-      </w:r>
-    </w:p>
-    <w:p>
-      <w:pPr>
-        <w:pStyle w:val="ListBullet"/>
-        <w:spacing w:before="20" w:after="40"/>
-      </w:pPr>
-      <w:r>
-        <w:rPr>
-          <w:rFonts w:ascii="Calibri" w:hAnsi="Calibri"/>
-          <w:b/>
-          <w:color w:val="0A0B0E"/>
-          <w:sz w:val="18"/>
-        </w:rPr>
-        <w:t xml:space="preserve">Team Building Meta: </w:t>
-      </w:r>
-      <w:r>
-        <w:rPr>
-          <w:rFonts w:ascii="Calibri" w:hAnsi="Calibri"/>
-          <w:i/>
-          <w:color w:val="1E293B"/>
-          <w:sz w:val="18"/>
-        </w:rPr>
-        <w:t>"Transform your executive retreat, leadership offsite, or company summit with Adrian Saint's interactive psychological team building. Foster communication, intuition, and trust through collective mentalism."</w:t>
-      </w:r>
-    </w:p>
-    <w:p>
-      <w:pPr>
-        <w:pStyle w:val="ListBullet"/>
-        <w:spacing w:before="20" w:after="40"/>
-      </w:pPr>
-      <w:r>
-        <w:rPr>
-          <w:rFonts w:ascii="Calibri" w:hAnsi="Calibri"/>
-          <w:b/>
-          <w:color w:val="0A0B0E"/>
-          <w:sz w:val="18"/>
-        </w:rPr>
-        <w:t xml:space="preserve">Regional Municipal Meta (Anaheim): </w:t>
-      </w:r>
-      <w:r>
-        <w:rPr>
-          <w:rFonts w:ascii="Calibri" w:hAnsi="Calibri"/>
-          <w:i/>
-          <w:color w:val="1E293B"/>
-          <w:sz w:val="18"/>
-        </w:rPr>
-        <w:t>"Looking for the top Corporate Magician &amp; Mentalist in Anaheim, CA? Adrian Saint delivers 100% clean, jaw-dropping psychological entertainment for Anaheim conventions, summits, and corporate galas."</w:t>
-      </w:r>
-    </w:p>
-    <w:p>
-      <w:pPr>
-        <w:spacing w:before="200" w:after="60"/>
-      </w:pPr>
-      <w:r>
-        <w:rPr>
-          <w:rFonts w:ascii="Calibri" w:hAnsi="Calibri"/>
-          <w:b/>
-          <w:color w:val="1E293B"/>
-          <w:sz w:val="23"/>
-        </w:rPr>
-        <w:t>C. Semantic Heading Hierarchy (H1 &gt; H2 &gt; H3 Silos) &amp; LSI Keywords</w:t>
-      </w:r>
-    </w:p>
-    <w:p>
-      <w:pPr>
-        <w:pStyle w:val="ListBullet"/>
-        <w:spacing w:before="20" w:after="40"/>
-      </w:pPr>
-      <w:r>
-        <w:rPr>
-          <w:rFonts w:ascii="Calibri" w:hAnsi="Calibri"/>
-          <w:b/>
-          <w:color w:val="0A0B0E"/>
-          <w:sz w:val="18"/>
-        </w:rPr>
-        <w:t xml:space="preserve">Single Focused &lt;h1&gt; per Page: </w:t>
-      </w:r>
-      <w:r>
-        <w:rPr>
-          <w:rFonts w:ascii="Calibri" w:hAnsi="Calibri"/>
-          <w:color w:val="1E293B"/>
-          <w:sz w:val="18"/>
-        </w:rPr>
-        <w:t>Unambiguous topic declaration preventing keyword cannibalization (e.g., "Corporate Stage Show", "Corporate Magician &amp; Mentalist in Irvine, CA").</w:t>
-      </w:r>
-    </w:p>
-    <w:p>
-      <w:pPr>
-        <w:pStyle w:val="ListBullet"/>
-        <w:spacing w:before="20" w:after="40"/>
-      </w:pPr>
-      <w:r>
-        <w:rPr>
-          <w:rFonts w:ascii="Calibri" w:hAnsi="Calibri"/>
-          <w:b/>
-          <w:color w:val="0A0B0E"/>
-          <w:sz w:val="18"/>
-        </w:rPr>
-        <w:t xml:space="preserve">Systematic &lt;h2&gt; Structural Modules: </w:t>
-      </w:r>
-      <w:r>
-        <w:rPr>
-          <w:rFonts w:ascii="Calibri" w:hAnsi="Calibri"/>
-          <w:color w:val="1E293B"/>
-          <w:sz w:val="18"/>
-        </w:rPr>
-        <w:t>Divided into buyer-journey sections: Performance Anatomy, Why Meeting Planners Choose Adrian Saint (HR-Safe, Turnkey Logistics), Curated Regional Venues, Social Proof, and FAQ Accordions.</w:t>
-      </w:r>
-    </w:p>
-    <w:p>
-      <w:pPr>
-        <w:pStyle w:val="ListBullet"/>
-        <w:spacing w:before="20" w:after="40"/>
-      </w:pPr>
-      <w:r>
-        <w:rPr>
-          <w:rFonts w:ascii="Calibri" w:hAnsi="Calibri"/>
-          <w:b/>
-          <w:color w:val="0A0B0E"/>
-          <w:sz w:val="18"/>
-        </w:rPr>
-        <w:t xml:space="preserve">Targeted &lt;h3&gt; Modular Cards: </w:t>
-      </w:r>
-      <w:r>
-        <w:rPr>
-          <w:rFonts w:ascii="Calibri" w:hAnsi="Calibri"/>
-          <w:color w:val="1E293B"/>
-          <w:sz w:val="18"/>
-        </w:rPr>
-        <w:t>Capturing specific corporate scenarios: Keynote Openers, Awards Banquets, Cocktail Receptions, Executive Retreats.</w:t>
-      </w:r>
-    </w:p>
-    <w:p>
-      <w:pPr>
-        <w:pStyle w:val="ListBullet"/>
-        <w:spacing w:before="20" w:after="40"/>
-      </w:pPr>
-      <w:r>
-        <w:rPr>
-          <w:rFonts w:ascii="Calibri" w:hAnsi="Calibri"/>
-          <w:b/>
-          <w:color w:val="0A0B0E"/>
-          <w:sz w:val="18"/>
-        </w:rPr>
-        <w:t xml:space="preserve">LSI &amp; Natural Keyword Density: </w:t>
-      </w:r>
-      <w:r>
-        <w:rPr>
-          <w:rFonts w:ascii="Calibri" w:hAnsi="Calibri"/>
-          <w:color w:val="1E293B"/>
-          <w:sz w:val="18"/>
-        </w:rPr>
-        <w:t>Seamlessly integrated high-value semantic phrases: corporate mentalist, corporate magician, mentalist for hire, banquet mind reader, trade show entertainer, 100% HR-safe, turnkey AV rider, zero-flight-delay drive-in, VIP cocktail mingling, icebreaker mind-sync.</w:t>
-      </w:r>
-    </w:p>
-    <w:p>
-      <w:pPr>
-        <w:pStyle w:val="ListBullet"/>
-        <w:spacing w:before="20" w:after="40"/>
-      </w:pPr>
-      <w:r>
-        <w:rPr>
-          <w:rFonts w:ascii="Calibri" w:hAnsi="Calibri"/>
-          <w:b/>
-          <w:color w:val="0A0B0E"/>
-          <w:sz w:val="18"/>
-        </w:rPr>
-        <w:t xml:space="preserve">Image SEO &amp; Alt Text Tags: </w:t>
-      </w:r>
-      <w:r>
-        <w:rPr>
-          <w:rFonts w:ascii="Calibri" w:hAnsi="Calibri"/>
-          <w:color w:val="1E293B"/>
-          <w:sz w:val="18"/>
-        </w:rPr>
-        <w:t>All 78 performance gallery photos, 43 enterprise &amp; institutional client logos, and 16 video thumbnails feature descriptive, keyword-rich alt tags for Google Image search indexation.</w:t>
-      </w:r>
-    </w:p>
     <w:p>
       <w:pPr>
         <w:spacing w:before="360" w:after="120"/>
@@ -957,7 +421,338 @@
           <w:color w:val="0A0B0E"/>
           <w:sz w:val="30"/>
         </w:rPr>
-        <w:t>2. Sitewide Internal Linking &amp; Silo Architecture</w:t>
+        <w:t>1. Site Building &amp; Architecture Milestones</w:t>
+      </w:r>
+    </w:p>
+    <w:p>
+      <w:pPr>
+        <w:spacing w:before="160" w:after="80"/>
+      </w:pPr>
+      <w:r>
+        <w:rPr>
+          <w:rFonts w:ascii="Calibri" w:hAnsi="Calibri"/>
+          <w:b/>
+          <w:color w:val="1E293B"/>
+          <w:sz w:val="24"/>
+        </w:rPr>
+        <w:t>A. Dedicated Service Landing Pages (3 New Pages)</w:t>
+      </w:r>
+    </w:p>
+    <w:p>
+      <w:pPr>
+        <w:pStyle w:val="ListBullet"/>
+        <w:spacing w:before="40" w:after="80"/>
+      </w:pPr>
+      <w:r>
+        <w:rPr>
+          <w:rFonts w:ascii="Calibri" w:hAnsi="Calibri"/>
+          <w:b/>
+          <w:sz w:val="20"/>
+        </w:rPr>
+        <w:t xml:space="preserve">Corporate Stage Show (/corporate-stage-show | alias /stage-show): </w:t>
+      </w:r>
+      <w:r>
+        <w:rPr>
+          <w:rFonts w:ascii="Calibri" w:hAnsi="Calibri"/>
+          <w:color w:val="1E293B"/>
+          <w:sz w:val="20"/>
+        </w:rPr>
+        <w:t>Comprehensive anatomy covering 30–75 min keynote openers, awards banquet headliners, and executive retreats. Details audience engagement, precision telepathy, turnkey AV requirements, and includes 6 bespoke service FAQs.</w:t>
+      </w:r>
+    </w:p>
+    <w:p>
+      <w:pPr>
+        <w:pStyle w:val="ListBullet"/>
+        <w:spacing w:before="40" w:after="80"/>
+      </w:pPr>
+      <w:r>
+        <w:rPr>
+          <w:rFonts w:ascii="Calibri" w:hAnsi="Calibri"/>
+          <w:b/>
+          <w:sz w:val="20"/>
+        </w:rPr>
+        <w:t xml:space="preserve">Strolling Mind Reading (/strolling-mind-reading | alias /strolling): </w:t>
+      </w:r>
+      <w:r>
+        <w:rPr>
+          <w:rFonts w:ascii="Calibri" w:hAnsi="Calibri"/>
+          <w:color w:val="1E293B"/>
+          <w:sz w:val="20"/>
+        </w:rPr>
+        <w:t>Tailored for cocktail hours, VIP mingling receptions, networking dinners, and trade show lead generation. Focuses on zero-footprint logistics, organic mingling dynamics, and includes 6 close-up FAQs.</w:t>
+      </w:r>
+    </w:p>
+    <w:p>
+      <w:pPr>
+        <w:pStyle w:val="ListBullet"/>
+        <w:spacing w:before="40" w:after="80"/>
+      </w:pPr>
+      <w:r>
+        <w:rPr>
+          <w:rFonts w:ascii="Calibri" w:hAnsi="Calibri"/>
+          <w:b/>
+          <w:sz w:val="20"/>
+        </w:rPr>
+        <w:t xml:space="preserve">Team Building (/team-building): </w:t>
+      </w:r>
+      <w:r>
+        <w:rPr>
+          <w:rFonts w:ascii="Calibri" w:hAnsi="Calibri"/>
+          <w:color w:val="1E293B"/>
+          <w:sz w:val="20"/>
+        </w:rPr>
+        <w:t>Interactive psychological mind-sync workshops for leadership retreats, corporate offsites, and cross-departmental collaboration. Highlights 100% dignified participation, intuition exercises, and 6 corporate FAQs.</w:t>
+      </w:r>
+    </w:p>
+    <w:p>
+      <w:pPr>
+        <w:spacing w:before="240" w:after="80"/>
+      </w:pPr>
+      <w:r>
+        <w:rPr>
+          <w:rFonts w:ascii="Calibri" w:hAnsi="Calibri"/>
+          <w:b/>
+          <w:color w:val="1E293B"/>
+          <w:sz w:val="24"/>
+        </w:rPr>
+        <w:t>B. Regional Local SEO Hubs (14 Target Municipalities)</w:t>
+      </w:r>
+    </w:p>
+    <w:p>
+      <w:pPr>
+        <w:spacing w:after="120"/>
+      </w:pPr>
+      <w:r>
+        <w:rPr>
+          <w:rFonts w:ascii="Calibri" w:hAnsi="Calibri"/>
+          <w:color w:val="1E293B"/>
+          <w:sz w:val="20"/>
+        </w:rPr>
+        <w:t>Built and deployed 14 dedicated local landing pages engineered to dominate Google organic and local queries for corporate entertainment:</w:t>
+      </w:r>
+    </w:p>
+    <w:p>
+      <w:pPr>
+        <w:pStyle w:val="ListBullet"/>
+        <w:spacing w:before="20" w:after="40"/>
+      </w:pPr>
+      <w:r>
+        <w:rPr>
+          <w:rFonts w:ascii="Calibri" w:hAnsi="Calibri"/>
+          <w:color w:val="1E293B"/>
+          <w:sz w:val="19"/>
+        </w:rPr>
+        <w:t>Los Angeles, CA (/corporate-magician-los-angeles | aliases: /los-angeles, /la)</w:t>
+      </w:r>
+    </w:p>
+    <w:p>
+      <w:pPr>
+        <w:pStyle w:val="ListBullet"/>
+        <w:spacing w:before="20" w:after="40"/>
+      </w:pPr>
+      <w:r>
+        <w:rPr>
+          <w:rFonts w:ascii="Calibri" w:hAnsi="Calibri"/>
+          <w:color w:val="1E293B"/>
+          <w:sz w:val="19"/>
+        </w:rPr>
+        <w:t>San Diego, CA (/corporate-magician-san-diego | alias: /san-diego)</w:t>
+      </w:r>
+    </w:p>
+    <w:p>
+      <w:pPr>
+        <w:pStyle w:val="ListBullet"/>
+        <w:spacing w:before="20" w:after="40"/>
+      </w:pPr>
+      <w:r>
+        <w:rPr>
+          <w:rFonts w:ascii="Calibri" w:hAnsi="Calibri"/>
+          <w:color w:val="1E293B"/>
+          <w:sz w:val="19"/>
+        </w:rPr>
+        <w:t>San Francisco, CA (/corporate-magician-san-francisco | aliases: /san-francisco, /sf)</w:t>
+      </w:r>
+    </w:p>
+    <w:p>
+      <w:pPr>
+        <w:pStyle w:val="ListBullet"/>
+        <w:spacing w:before="20" w:after="40"/>
+      </w:pPr>
+      <w:r>
+        <w:rPr>
+          <w:rFonts w:ascii="Calibri" w:hAnsi="Calibri"/>
+          <w:color w:val="1E293B"/>
+          <w:sz w:val="19"/>
+        </w:rPr>
+        <w:t>Phoenix, AZ (/corporate-magician-phoenix | alias: /phoenix)</w:t>
+      </w:r>
+    </w:p>
+    <w:p>
+      <w:pPr>
+        <w:pStyle w:val="ListBullet"/>
+        <w:spacing w:before="20" w:after="40"/>
+      </w:pPr>
+      <w:r>
+        <w:rPr>
+          <w:rFonts w:ascii="Calibri" w:hAnsi="Calibri"/>
+          <w:color w:val="1E293B"/>
+          <w:sz w:val="19"/>
+        </w:rPr>
+        <w:t>Scottsdale, AZ (/corporate-magician-scottsdale | alias: /scottsdale)</w:t>
+      </w:r>
+    </w:p>
+    <w:p>
+      <w:pPr>
+        <w:pStyle w:val="ListBullet"/>
+        <w:spacing w:before="20" w:after="40"/>
+      </w:pPr>
+      <w:r>
+        <w:rPr>
+          <w:rFonts w:ascii="Calibri" w:hAnsi="Calibri"/>
+          <w:color w:val="1E293B"/>
+          <w:sz w:val="19"/>
+        </w:rPr>
+        <w:t>Anaheim, CA (/corporate-magician-anaheim | alias: /anaheim)</w:t>
+      </w:r>
+    </w:p>
+    <w:p>
+      <w:pPr>
+        <w:pStyle w:val="ListBullet"/>
+        <w:spacing w:before="20" w:after="40"/>
+      </w:pPr>
+      <w:r>
+        <w:rPr>
+          <w:rFonts w:ascii="Calibri" w:hAnsi="Calibri"/>
+          <w:color w:val="1E293B"/>
+          <w:sz w:val="19"/>
+        </w:rPr>
+        <w:t>Irvine, CA (/corporate-magician-irvine | alias: /irvine)</w:t>
+      </w:r>
+    </w:p>
+    <w:p>
+      <w:pPr>
+        <w:pStyle w:val="ListBullet"/>
+        <w:spacing w:before="20" w:after="40"/>
+      </w:pPr>
+      <w:r>
+        <w:rPr>
+          <w:rFonts w:ascii="Calibri" w:hAnsi="Calibri"/>
+          <w:color w:val="1E293B"/>
+          <w:sz w:val="19"/>
+        </w:rPr>
+        <w:t>Santa Ana, CA (/corporate-magician-santa-ana | alias: /santa-ana)</w:t>
+      </w:r>
+    </w:p>
+    <w:p>
+      <w:pPr>
+        <w:pStyle w:val="ListBullet"/>
+        <w:spacing w:before="20" w:after="40"/>
+      </w:pPr>
+      <w:r>
+        <w:rPr>
+          <w:rFonts w:ascii="Calibri" w:hAnsi="Calibri"/>
+          <w:color w:val="1E293B"/>
+          <w:sz w:val="19"/>
+        </w:rPr>
+        <w:t>Huntington Beach, CA (/corporate-magician-huntington-beach | aliases: /huntington-beach, /hb)</w:t>
+      </w:r>
+    </w:p>
+    <w:p>
+      <w:pPr>
+        <w:pStyle w:val="ListBullet"/>
+        <w:spacing w:before="20" w:after="40"/>
+      </w:pPr>
+      <w:r>
+        <w:rPr>
+          <w:rFonts w:ascii="Calibri" w:hAnsi="Calibri"/>
+          <w:color w:val="1E293B"/>
+          <w:sz w:val="19"/>
+        </w:rPr>
+        <w:t>Garden Grove, CA (/corporate-magician-garden-grove | alias: /garden-grove)</w:t>
+      </w:r>
+    </w:p>
+    <w:p>
+      <w:pPr>
+        <w:pStyle w:val="ListBullet"/>
+        <w:spacing w:before="20" w:after="40"/>
+      </w:pPr>
+      <w:r>
+        <w:rPr>
+          <w:rFonts w:ascii="Calibri" w:hAnsi="Calibri"/>
+          <w:color w:val="1E293B"/>
+          <w:sz w:val="19"/>
+        </w:rPr>
+        <w:t>Newport Beach, CA (/corporate-magician-newport-beach | aliases: /newport-beach, /newport, /nb)</w:t>
+      </w:r>
+    </w:p>
+    <w:p>
+      <w:pPr>
+        <w:pStyle w:val="ListBullet"/>
+        <w:spacing w:before="20" w:after="40"/>
+      </w:pPr>
+      <w:r>
+        <w:rPr>
+          <w:rFonts w:ascii="Calibri" w:hAnsi="Calibri"/>
+          <w:color w:val="1E293B"/>
+          <w:sz w:val="19"/>
+        </w:rPr>
+        <w:t>Palm Springs, CA (/corporate-magician-palm-springs | aliases: /palm-springs, /ps)</w:t>
+      </w:r>
+    </w:p>
+    <w:p>
+      <w:pPr>
+        <w:pStyle w:val="ListBullet"/>
+        <w:spacing w:before="20" w:after="40"/>
+      </w:pPr>
+      <w:r>
+        <w:rPr>
+          <w:rFonts w:ascii="Calibri" w:hAnsi="Calibri"/>
+          <w:color w:val="1E293B"/>
+          <w:sz w:val="19"/>
+        </w:rPr>
+        <w:t>Palm Desert, CA (/corporate-magician-palm-desert | aliases: /palm-desert, /pd)</w:t>
+      </w:r>
+    </w:p>
+    <w:p>
+      <w:pPr>
+        <w:pStyle w:val="ListBullet"/>
+        <w:spacing w:before="20" w:after="40"/>
+      </w:pPr>
+      <w:r>
+        <w:rPr>
+          <w:rFonts w:ascii="Calibri" w:hAnsi="Calibri"/>
+          <w:color w:val="1E293B"/>
+          <w:sz w:val="19"/>
+        </w:rPr>
+        <w:t>Napa Valley, CA (/corporate-magician-napa | aliases: /napa, /napa-valley, /wine-country)</w:t>
+      </w:r>
+    </w:p>
+    <w:p>
+      <w:pPr>
+        <w:spacing w:before="80" w:after="200"/>
+      </w:pPr>
+      <w:r>
+        <w:rPr>
+          <w:rFonts w:ascii="Calibri" w:hAnsi="Calibri"/>
+          <w:i/>
+          <w:color w:val="64748B"/>
+          <w:sz w:val="19"/>
+        </w:rPr>
+        <w:t>Each city page includes exact municipal GPS coordinates, areaServed Schema.org markup, 3 curated premier venue cards (e.g., Anaheim Convention Center, Hyatt Regency Irvine, Bowers Museum, Waterfront Beach Resort, Resort at Pelican Hill, Palm Springs Convention Center, JW Marriott Desert Springs, Meritage Resort &amp; Wine Caves), local zero-flight-delay drive-in logistics callouts, and 5 localized venue/event FAQs.</w:t>
+      </w:r>
+    </w:p>
+    <w:p>
+      <w:pPr>
+        <w:spacing w:before="320" w:after="120"/>
+      </w:pPr>
+      <w:r>
+        <w:rPr>
+          <w:rFonts w:ascii="Georgia" w:hAnsi="Georgia"/>
+          <w:b/>
+          <w:color w:val="0A0B0E"/>
+          <w:sz w:val="30"/>
+        </w:rPr>
+        <w:t>2. Conversion Rate Optimization (CRO) &amp; Media Assets</w:t>
       </w:r>
     </w:p>
     <w:tbl>
@@ -1003,841 +798,7 @@
                 <w:color w:val="FFFFFF"/>
                 <w:sz w:val="18"/>
               </w:rPr>
-              <w:t>INTERNAL LINKING CHANNEL</w:t>
-            </w:r>
-          </w:p>
-        </w:tc>
-        <w:tc>
-          <w:tcPr>
-            <w:tcW w:type="dxa" w:w="3120"/>
-            <w:shd w:fill="12141A"/>
-            <w:tcMar>
-              <w:top w:w="140" w:type="dxa"/>
-              <w:bottom w:w="140" w:type="dxa"/>
-              <w:left w:w="140" w:type="dxa"/>
-              <w:right w:w="140" w:type="dxa"/>
-            </w:tcMar>
-          </w:tcPr>
-          <w:p>
-            <w:pPr>
-              <w:spacing w:before="0" w:after="0"/>
-            </w:pPr>
-            <w:r>
-              <w:rPr>
-                <w:rFonts w:ascii="Calibri" w:hAnsi="Calibri"/>
-                <w:b/>
-                <w:color w:val="FFFFFF"/>
-                <w:sz w:val="18"/>
-              </w:rPr>
-              <w:t>IMPLEMENTATION DETAILS</w:t>
-            </w:r>
-          </w:p>
-        </w:tc>
-        <w:tc>
-          <w:tcPr>
-            <w:tcW w:type="dxa" w:w="3120"/>
-            <w:shd w:fill="12141A"/>
-            <w:tcMar>
-              <w:top w:w="140" w:type="dxa"/>
-              <w:bottom w:w="140" w:type="dxa"/>
-              <w:left w:w="140" w:type="dxa"/>
-              <w:right w:w="140" w:type="dxa"/>
-            </w:tcMar>
-          </w:tcPr>
-          <w:p>
-            <w:pPr>
-              <w:spacing w:before="0" w:after="0"/>
-            </w:pPr>
-            <w:r>
-              <w:rPr>
-                <w:rFonts w:ascii="Calibri" w:hAnsi="Calibri"/>
-                <w:b/>
-                <w:color w:val="FFFFFF"/>
-                <w:sz w:val="18"/>
-              </w:rPr>
-              <w:t>SEO &amp; NAVIGATION IMPACT</w:t>
-            </w:r>
-          </w:p>
-        </w:tc>
-      </w:tr>
-      <w:tr>
-        <w:tc>
-          <w:tcPr>
-            <w:tcW w:type="dxa" w:w="2592"/>
-            <w:shd w:fill="F8FAFC"/>
-            <w:tcMar>
-              <w:top w:w="100" w:type="dxa"/>
-              <w:bottom w:w="100" w:type="dxa"/>
-              <w:left w:w="140" w:type="dxa"/>
-              <w:right w:w="140" w:type="dxa"/>
-            </w:tcMar>
-          </w:tcPr>
-          <w:p>
-            <w:pPr>
-              <w:spacing w:before="0" w:after="0"/>
-            </w:pPr>
-            <w:r>
-              <w:rPr>
-                <w:rFonts w:ascii="Calibri" w:hAnsi="Calibri"/>
-                <w:b/>
-                <w:color w:val="0A0B0E"/>
-                <w:sz w:val="18"/>
-              </w:rPr>
-              <w:t>Global Footer Navigation (Col 2)</w:t>
-            </w:r>
-          </w:p>
-        </w:tc>
-        <w:tc>
-          <w:tcPr>
-            <w:tcW w:type="dxa" w:w="3744"/>
-            <w:shd w:fill="F8FAFC"/>
-            <w:tcMar>
-              <w:top w:w="100" w:type="dxa"/>
-              <w:bottom w:w="100" w:type="dxa"/>
-              <w:left w:w="140" w:type="dxa"/>
-              <w:right w:w="140" w:type="dxa"/>
-            </w:tcMar>
-          </w:tcPr>
-          <w:p>
-            <w:pPr>
-              <w:spacing w:before="0" w:after="0"/>
-            </w:pPr>
-            <w:r>
-              <w:rPr>
-                <w:rFonts w:ascii="Calibri" w:hAnsi="Calibri"/>
-                <w:color w:val="1E293B"/>
-                <w:sz w:val="18"/>
-              </w:rPr>
-              <w:t>Updated Column 2 across all 15 HTML files to link directly to /corporate-stage-show, /strolling-mind-reading, /team-building, and /contact.</w:t>
-            </w:r>
-          </w:p>
-        </w:tc>
-        <w:tc>
-          <w:tcPr>
-            <w:tcW w:type="dxa" w:w="3024"/>
-            <w:shd w:fill="F8FAFC"/>
-            <w:tcMar>
-              <w:top w:w="100" w:type="dxa"/>
-              <w:bottom w:w="100" w:type="dxa"/>
-              <w:left w:w="140" w:type="dxa"/>
-              <w:right w:w="140" w:type="dxa"/>
-            </w:tcMar>
-          </w:tcPr>
-          <w:p>
-            <w:pPr>
-              <w:spacing w:before="0" w:after="0"/>
-            </w:pPr>
-            <w:r>
-              <w:rPr>
-                <w:rFonts w:ascii="Calibri" w:hAnsi="Calibri"/>
-                <w:color w:val="1E293B"/>
-                <w:sz w:val="18"/>
-              </w:rPr>
-              <w:t>Passes sitewide crawl equity directly to revenue-driving core services.</w:t>
-            </w:r>
-          </w:p>
-        </w:tc>
-      </w:tr>
-      <w:tr>
-        <w:tc>
-          <w:tcPr>
-            <w:tcW w:type="dxa" w:w="2592"/>
-            <w:shd w:fill="FFFFFF"/>
-            <w:tcMar>
-              <w:top w:w="100" w:type="dxa"/>
-              <w:bottom w:w="100" w:type="dxa"/>
-              <w:left w:w="140" w:type="dxa"/>
-              <w:right w:w="140" w:type="dxa"/>
-            </w:tcMar>
-          </w:tcPr>
-          <w:p>
-            <w:pPr>
-              <w:spacing w:before="0" w:after="0"/>
-            </w:pPr>
-            <w:r>
-              <w:rPr>
-                <w:rFonts w:ascii="Calibri" w:hAnsi="Calibri"/>
-                <w:b/>
-                <w:color w:val="0A0B0E"/>
-                <w:sz w:val="18"/>
-              </w:rPr>
-              <w:t>In-Content Exploratory Links</w:t>
-            </w:r>
-          </w:p>
-        </w:tc>
-        <w:tc>
-          <w:tcPr>
-            <w:tcW w:type="dxa" w:w="3744"/>
-            <w:shd w:fill="FFFFFF"/>
-            <w:tcMar>
-              <w:top w:w="100" w:type="dxa"/>
-              <w:bottom w:w="100" w:type="dxa"/>
-              <w:left w:w="140" w:type="dxa"/>
-              <w:right w:w="140" w:type="dxa"/>
-            </w:tcMar>
-          </w:tcPr>
-          <w:p>
-            <w:pPr>
-              <w:spacing w:before="0" w:after="0"/>
-            </w:pPr>
-            <w:r>
-              <w:rPr>
-                <w:rFonts w:ascii="Calibri" w:hAnsi="Calibri"/>
-                <w:color w:val="1E293B"/>
-                <w:sz w:val="18"/>
-              </w:rPr>
-              <w:t>Embedded contextual exploration text links ("Explore Stage Show Format →", etc.) inside Performance Package cards on Homepage &amp; all 10 Location Pages.</w:t>
-            </w:r>
-          </w:p>
-        </w:tc>
-        <w:tc>
-          <w:tcPr>
-            <w:tcW w:type="dxa" w:w="3024"/>
-            <w:shd w:fill="FFFFFF"/>
-            <w:tcMar>
-              <w:top w:w="100" w:type="dxa"/>
-              <w:bottom w:w="100" w:type="dxa"/>
-              <w:left w:w="140" w:type="dxa"/>
-              <w:right w:w="140" w:type="dxa"/>
-            </w:tcMar>
-          </w:tcPr>
-          <w:p>
-            <w:pPr>
-              <w:spacing w:before="0" w:after="0"/>
-            </w:pPr>
-            <w:r>
-              <w:rPr>
-                <w:rFonts w:ascii="Calibri" w:hAnsi="Calibri"/>
-                <w:color w:val="1E293B"/>
-                <w:sz w:val="18"/>
-              </w:rPr>
-              <w:t>Provides descriptive contextual relevance without interfering with modal booking buttons.</w:t>
-            </w:r>
-          </w:p>
-        </w:tc>
-      </w:tr>
-      <w:tr>
-        <w:tc>
-          <w:tcPr>
-            <w:tcW w:type="dxa" w:w="2592"/>
-            <w:shd w:fill="F8FAFC"/>
-            <w:tcMar>
-              <w:top w:w="100" w:type="dxa"/>
-              <w:bottom w:w="100" w:type="dxa"/>
-              <w:left w:w="140" w:type="dxa"/>
-              <w:right w:w="140" w:type="dxa"/>
-            </w:tcMar>
-          </w:tcPr>
-          <w:p>
-            <w:pPr>
-              <w:spacing w:before="0" w:after="0"/>
-            </w:pPr>
-            <w:r>
-              <w:rPr>
-                <w:rFonts w:ascii="Calibri" w:hAnsi="Calibri"/>
-                <w:b/>
-                <w:color w:val="0A0B0E"/>
-                <w:sz w:val="18"/>
-              </w:rPr>
-              <w:t>Service Cross-Linking Grid</w:t>
-            </w:r>
-          </w:p>
-        </w:tc>
-        <w:tc>
-          <w:tcPr>
-            <w:tcW w:type="dxa" w:w="3744"/>
-            <w:shd w:fill="F8FAFC"/>
-            <w:tcMar>
-              <w:top w:w="100" w:type="dxa"/>
-              <w:bottom w:w="100" w:type="dxa"/>
-              <w:left w:w="140" w:type="dxa"/>
-              <w:right w:w="140" w:type="dxa"/>
-            </w:tcMar>
-          </w:tcPr>
-          <w:p>
-            <w:pPr>
-              <w:spacing w:before="0" w:after="0"/>
-            </w:pPr>
-            <w:r>
-              <w:rPr>
-                <w:rFonts w:ascii="Calibri" w:hAnsi="Calibri"/>
-                <w:color w:val="1E293B"/>
-                <w:sz w:val="18"/>
-              </w:rPr>
-              <w:t>Built "Complementary Entertainment Formats" 2-card module on each service page linking to the other two formats.</w:t>
-            </w:r>
-          </w:p>
-        </w:tc>
-        <w:tc>
-          <w:tcPr>
-            <w:tcW w:type="dxa" w:w="3024"/>
-            <w:shd w:fill="F8FAFC"/>
-            <w:tcMar>
-              <w:top w:w="100" w:type="dxa"/>
-              <w:bottom w:w="100" w:type="dxa"/>
-              <w:left w:w="140" w:type="dxa"/>
-              <w:right w:w="140" w:type="dxa"/>
-            </w:tcMar>
-          </w:tcPr>
-          <w:p>
-            <w:pPr>
-              <w:spacing w:before="0" w:after="0"/>
-            </w:pPr>
-            <w:r>
-              <w:rPr>
-                <w:rFonts w:ascii="Calibri" w:hAnsi="Calibri"/>
-                <w:color w:val="1E293B"/>
-                <w:sz w:val="18"/>
-              </w:rPr>
-              <w:t>Encourages multi-format package bookings (e.g. Strolling Cocktail + Stage Banquet Headliner).</w:t>
-            </w:r>
-          </w:p>
-        </w:tc>
-      </w:tr>
-      <w:tr>
-        <w:tc>
-          <w:tcPr>
-            <w:tcW w:type="dxa" w:w="2592"/>
-            <w:shd w:fill="FFFFFF"/>
-            <w:tcMar>
-              <w:top w:w="100" w:type="dxa"/>
-              <w:bottom w:w="100" w:type="dxa"/>
-              <w:left w:w="140" w:type="dxa"/>
-              <w:right w:w="140" w:type="dxa"/>
-            </w:tcMar>
-          </w:tcPr>
-          <w:p>
-            <w:pPr>
-              <w:spacing w:before="0" w:after="0"/>
-            </w:pPr>
-            <w:r>
-              <w:rPr>
-                <w:rFonts w:ascii="Calibri" w:hAnsi="Calibri"/>
-                <w:b/>
-                <w:color w:val="0A0B0E"/>
-                <w:sz w:val="18"/>
-              </w:rPr>
-              <w:t>Geographic Service Anchors</w:t>
-            </w:r>
-          </w:p>
-        </w:tc>
-        <w:tc>
-          <w:tcPr>
-            <w:tcW w:type="dxa" w:w="3744"/>
-            <w:shd w:fill="FFFFFF"/>
-            <w:tcMar>
-              <w:top w:w="100" w:type="dxa"/>
-              <w:bottom w:w="100" w:type="dxa"/>
-              <w:left w:w="140" w:type="dxa"/>
-              <w:right w:w="140" w:type="dxa"/>
-            </w:tcMar>
-          </w:tcPr>
-          <w:p>
-            <w:pPr>
-              <w:spacing w:before="0" w:after="0"/>
-            </w:pPr>
-            <w:r>
-              <w:rPr>
-                <w:rFonts w:ascii="Calibri" w:hAnsi="Calibri"/>
-                <w:color w:val="1E293B"/>
-                <w:sz w:val="18"/>
-              </w:rPr>
-              <w:t>Added "Turnkey Production &amp; Regional Travel" sections on service pages linking down to top convention hubs (LA, SD, Irvine, Anaheim, SF, Phoenix, Scottsdale).</w:t>
-            </w:r>
-          </w:p>
-        </w:tc>
-        <w:tc>
-          <w:tcPr>
-            <w:tcW w:type="dxa" w:w="3024"/>
-            <w:shd w:fill="FFFFFF"/>
-            <w:tcMar>
-              <w:top w:w="100" w:type="dxa"/>
-              <w:bottom w:w="100" w:type="dxa"/>
-              <w:left w:w="140" w:type="dxa"/>
-              <w:right w:w="140" w:type="dxa"/>
-            </w:tcMar>
-          </w:tcPr>
-          <w:p>
-            <w:pPr>
-              <w:spacing w:before="0" w:after="0"/>
-            </w:pPr>
-            <w:r>
-              <w:rPr>
-                <w:rFonts w:ascii="Calibri" w:hAnsi="Calibri"/>
-                <w:color w:val="1E293B"/>
-                <w:sz w:val="18"/>
-              </w:rPr>
-              <w:t>Transfers topical authority between high-authority service pages and municipal landing pages.</w:t>
-            </w:r>
-          </w:p>
-        </w:tc>
-      </w:tr>
-      <w:tr>
-        <w:tc>
-          <w:tcPr>
-            <w:tcW w:type="dxa" w:w="2592"/>
-            <w:shd w:fill="F8FAFC"/>
-            <w:tcMar>
-              <w:top w:w="100" w:type="dxa"/>
-              <w:bottom w:w="100" w:type="dxa"/>
-              <w:left w:w="140" w:type="dxa"/>
-              <w:right w:w="140" w:type="dxa"/>
-            </w:tcMar>
-          </w:tcPr>
-          <w:p>
-            <w:pPr>
-              <w:spacing w:before="0" w:after="0"/>
-            </w:pPr>
-            <w:r>
-              <w:rPr>
-                <w:rFonts w:ascii="Calibri" w:hAnsi="Calibri"/>
-                <w:b/>
-                <w:color w:val="0A0B0E"/>
-                <w:sz w:val="18"/>
-              </w:rPr>
-              <w:t>Structured Breadcrumbs</w:t>
-            </w:r>
-          </w:p>
-        </w:tc>
-        <w:tc>
-          <w:tcPr>
-            <w:tcW w:type="dxa" w:w="3744"/>
-            <w:shd w:fill="F8FAFC"/>
-            <w:tcMar>
-              <w:top w:w="100" w:type="dxa"/>
-              <w:bottom w:w="100" w:type="dxa"/>
-              <w:left w:w="140" w:type="dxa"/>
-              <w:right w:w="140" w:type="dxa"/>
-            </w:tcMar>
-          </w:tcPr>
-          <w:p>
-            <w:pPr>
-              <w:spacing w:before="0" w:after="0"/>
-            </w:pPr>
-            <w:r>
-              <w:rPr>
-                <w:rFonts w:ascii="Calibri" w:hAnsi="Calibri"/>
-                <w:color w:val="1E293B"/>
-                <w:sz w:val="18"/>
-              </w:rPr>
-              <w:t>Implemented hierarchical breadcrumbs (Home &gt; Entertainment Options &gt; [Service]) with schema markup across all interior pages.</w:t>
-            </w:r>
-          </w:p>
-        </w:tc>
-        <w:tc>
-          <w:tcPr>
-            <w:tcW w:type="dxa" w:w="3024"/>
-            <w:shd w:fill="F8FAFC"/>
-            <w:tcMar>
-              <w:top w:w="100" w:type="dxa"/>
-              <w:bottom w:w="100" w:type="dxa"/>
-              <w:left w:w="140" w:type="dxa"/>
-              <w:right w:w="140" w:type="dxa"/>
-            </w:tcMar>
-          </w:tcPr>
-          <w:p>
-            <w:pPr>
-              <w:spacing w:before="0" w:after="0"/>
-            </w:pPr>
-            <w:r>
-              <w:rPr>
-                <w:rFonts w:ascii="Calibri" w:hAnsi="Calibri"/>
-                <w:color w:val="1E293B"/>
-                <w:sz w:val="18"/>
-              </w:rPr>
-              <w:t>Improves Google SERP snippet display with breadcrumb pathways.</w:t>
-            </w:r>
-          </w:p>
-        </w:tc>
-      </w:tr>
-      <w:tr>
-        <w:tc>
-          <w:tcPr>
-            <w:tcW w:type="dxa" w:w="2592"/>
-            <w:shd w:fill="FFFFFF"/>
-            <w:tcMar>
-              <w:top w:w="100" w:type="dxa"/>
-              <w:bottom w:w="100" w:type="dxa"/>
-              <w:left w:w="140" w:type="dxa"/>
-              <w:right w:w="140" w:type="dxa"/>
-            </w:tcMar>
-          </w:tcPr>
-          <w:p>
-            <w:pPr>
-              <w:spacing w:before="0" w:after="0"/>
-            </w:pPr>
-            <w:r>
-              <w:rPr>
-                <w:rFonts w:ascii="Calibri" w:hAnsi="Calibri"/>
-                <w:b/>
-                <w:color w:val="0A0B0E"/>
-                <w:sz w:val="18"/>
-              </w:rPr>
-              <w:t>Mobile Drawer Integration</w:t>
-            </w:r>
-          </w:p>
-        </w:tc>
-        <w:tc>
-          <w:tcPr>
-            <w:tcW w:type="dxa" w:w="3744"/>
-            <w:shd w:fill="FFFFFF"/>
-            <w:tcMar>
-              <w:top w:w="100" w:type="dxa"/>
-              <w:bottom w:w="100" w:type="dxa"/>
-              <w:left w:w="140" w:type="dxa"/>
-              <w:right w:w="140" w:type="dxa"/>
-            </w:tcMar>
-          </w:tcPr>
-          <w:p>
-            <w:pPr>
-              <w:spacing w:before="0" w:after="0"/>
-            </w:pPr>
-            <w:r>
-              <w:rPr>
-                <w:rFonts w:ascii="Calibri" w:hAnsi="Calibri"/>
-                <w:color w:val="1E293B"/>
-                <w:sz w:val="18"/>
-              </w:rPr>
-              <w:t>Expanded mobile navigation across all 15 pages to feature crawlable links to all 3 service formats.</w:t>
-            </w:r>
-          </w:p>
-        </w:tc>
-        <w:tc>
-          <w:tcPr>
-            <w:tcW w:type="dxa" w:w="3024"/>
-            <w:shd w:fill="FFFFFF"/>
-            <w:tcMar>
-              <w:top w:w="100" w:type="dxa"/>
-              <w:bottom w:w="100" w:type="dxa"/>
-              <w:left w:w="140" w:type="dxa"/>
-              <w:right w:w="140" w:type="dxa"/>
-            </w:tcMar>
-          </w:tcPr>
-          <w:p>
-            <w:pPr>
-              <w:spacing w:before="0" w:after="0"/>
-            </w:pPr>
-            <w:r>
-              <w:rPr>
-                <w:rFonts w:ascii="Calibri" w:hAnsi="Calibri"/>
-                <w:color w:val="1E293B"/>
-                <w:sz w:val="18"/>
-              </w:rPr>
-              <w:t>Ensures 100% crawl discoverability for mobile search bots.</w:t>
-            </w:r>
-          </w:p>
-        </w:tc>
-      </w:tr>
-    </w:tbl>
-    <w:p>
-      <w:pPr>
-        <w:spacing w:before="360" w:after="120"/>
-      </w:pPr>
-      <w:r>
-        <w:rPr>
-          <w:rFonts w:ascii="Georgia" w:hAnsi="Georgia"/>
-          <w:b/>
-          <w:color w:val="0A0B0E"/>
-          <w:sz w:val="30"/>
-        </w:rPr>
-        <w:t>3. Site Building &amp; Regional Expansion Milestones</w:t>
-      </w:r>
-    </w:p>
-    <w:p>
-      <w:pPr>
-        <w:spacing w:before="80" w:after="40"/>
-      </w:pPr>
-      <w:r>
-        <w:rPr>
-          <w:rFonts w:ascii="Calibri" w:hAnsi="Calibri"/>
-          <w:b/>
-          <w:color w:val="1E293B"/>
-          <w:sz w:val="23"/>
-        </w:rPr>
-        <w:t>A. Dedicated Service Landing Pages (3 New Pages)</w:t>
-      </w:r>
-    </w:p>
-    <w:p>
-      <w:pPr>
-        <w:pStyle w:val="ListBullet"/>
-        <w:spacing w:before="20" w:after="60"/>
-      </w:pPr>
-      <w:r>
-        <w:rPr>
-          <w:rFonts w:ascii="Calibri" w:hAnsi="Calibri"/>
-          <w:b/>
-          <w:color w:val="0A0B0E"/>
-          <w:sz w:val="19"/>
-        </w:rPr>
-        <w:t xml:space="preserve">Corporate Stage Show (/corporate-stage-show | alias /stage-show): </w:t>
-      </w:r>
-      <w:r>
-        <w:rPr>
-          <w:rFonts w:ascii="Calibri" w:hAnsi="Calibri"/>
-          <w:color w:val="1E293B"/>
-          <w:sz w:val="19"/>
-        </w:rPr>
-        <w:t>Keynote opener (30–45 min), Banquet headliner (45–60 min), and Executive showcase (60–75 min). Features room engagement breakdown, precision telepathy, turnkey AV requirements, and 6 bespoke service FAQs.</w:t>
-      </w:r>
-    </w:p>
-    <w:p>
-      <w:pPr>
-        <w:pStyle w:val="ListBullet"/>
-        <w:spacing w:before="20" w:after="60"/>
-      </w:pPr>
-      <w:r>
-        <w:rPr>
-          <w:rFonts w:ascii="Calibri" w:hAnsi="Calibri"/>
-          <w:b/>
-          <w:color w:val="0A0B0E"/>
-          <w:sz w:val="19"/>
-        </w:rPr>
-        <w:t xml:space="preserve">Strolling Mind Reading (/strolling-mind-reading | alias /strolling): </w:t>
-      </w:r>
-      <w:r>
-        <w:rPr>
-          <w:rFonts w:ascii="Calibri" w:hAnsi="Calibri"/>
-          <w:color w:val="1E293B"/>
-          <w:sz w:val="19"/>
-        </w:rPr>
-        <w:t>Cocktail receptions, VIP hospitality suites, and trade show lead generation. Focuses on zero-footprint logistics, organic mingling dynamics, and 6 close-up FAQs.</w:t>
-      </w:r>
-    </w:p>
-    <w:p>
-      <w:pPr>
-        <w:pStyle w:val="ListBullet"/>
-        <w:spacing w:before="20" w:after="60"/>
-      </w:pPr>
-      <w:r>
-        <w:rPr>
-          <w:rFonts w:ascii="Calibri" w:hAnsi="Calibri"/>
-          <w:b/>
-          <w:color w:val="0A0B0E"/>
-          <w:sz w:val="19"/>
-        </w:rPr>
-        <w:t xml:space="preserve">Team Building (/team-building): </w:t>
-      </w:r>
-      <w:r>
-        <w:rPr>
-          <w:rFonts w:ascii="Calibri" w:hAnsi="Calibri"/>
-          <w:color w:val="1E293B"/>
-          <w:sz w:val="19"/>
-        </w:rPr>
-        <w:t>Interactive psychological mind-sync workshops for leadership retreats and cross-departmental summits. Highlights 100% dignified participation, intuition exercises, and 6 corporate FAQs.</w:t>
-      </w:r>
-    </w:p>
-    <w:p>
-      <w:pPr>
-        <w:spacing w:before="160" w:after="40"/>
-      </w:pPr>
-      <w:r>
-        <w:rPr>
-          <w:rFonts w:ascii="Calibri" w:hAnsi="Calibri"/>
-          <w:b/>
-          <w:color w:val="1E293B"/>
-          <w:sz w:val="23"/>
-        </w:rPr>
-        <w:t>B. Regional Local SEO Hubs (10 Target Municipalities)</w:t>
-      </w:r>
-    </w:p>
-    <w:p>
-      <w:pPr>
-        <w:pStyle w:val="ListBullet"/>
-        <w:spacing w:before="20" w:after="40"/>
-      </w:pPr>
-      <w:r>
-        <w:rPr>
-          <w:rFonts w:ascii="Calibri" w:hAnsi="Calibri"/>
-          <w:color w:val="1E293B"/>
-          <w:sz w:val="18"/>
-        </w:rPr>
-        <w:t>Los Angeles, CA (/corporate-magician-los-angeles | aliases: /los-angeles, /la)</w:t>
-      </w:r>
-    </w:p>
-    <w:p>
-      <w:pPr>
-        <w:pStyle w:val="ListBullet"/>
-        <w:spacing w:before="20" w:after="40"/>
-      </w:pPr>
-      <w:r>
-        <w:rPr>
-          <w:rFonts w:ascii="Calibri" w:hAnsi="Calibri"/>
-          <w:color w:val="1E293B"/>
-          <w:sz w:val="18"/>
-        </w:rPr>
-        <w:t>San Diego, CA (/corporate-magician-san-diego | alias: /san-diego)</w:t>
-      </w:r>
-    </w:p>
-    <w:p>
-      <w:pPr>
-        <w:pStyle w:val="ListBullet"/>
-        <w:spacing w:before="20" w:after="40"/>
-      </w:pPr>
-      <w:r>
-        <w:rPr>
-          <w:rFonts w:ascii="Calibri" w:hAnsi="Calibri"/>
-          <w:color w:val="1E293B"/>
-          <w:sz w:val="18"/>
-        </w:rPr>
-        <w:t>San Francisco, CA (/corporate-magician-san-francisco | aliases: /san-francisco, /sf)</w:t>
-      </w:r>
-    </w:p>
-    <w:p>
-      <w:pPr>
-        <w:pStyle w:val="ListBullet"/>
-        <w:spacing w:before="20" w:after="40"/>
-      </w:pPr>
-      <w:r>
-        <w:rPr>
-          <w:rFonts w:ascii="Calibri" w:hAnsi="Calibri"/>
-          <w:color w:val="1E293B"/>
-          <w:sz w:val="18"/>
-        </w:rPr>
-        <w:t>Phoenix, AZ (/corporate-magician-phoenix | alias: /phoenix)</w:t>
-      </w:r>
-    </w:p>
-    <w:p>
-      <w:pPr>
-        <w:pStyle w:val="ListBullet"/>
-        <w:spacing w:before="20" w:after="40"/>
-      </w:pPr>
-      <w:r>
-        <w:rPr>
-          <w:rFonts w:ascii="Calibri" w:hAnsi="Calibri"/>
-          <w:color w:val="1E293B"/>
-          <w:sz w:val="18"/>
-        </w:rPr>
-        <w:t>Scottsdale, AZ (/corporate-magician-scottsdale | alias: /scottsdale)</w:t>
-      </w:r>
-    </w:p>
-    <w:p>
-      <w:pPr>
-        <w:pStyle w:val="ListBullet"/>
-        <w:spacing w:before="20" w:after="40"/>
-      </w:pPr>
-      <w:r>
-        <w:rPr>
-          <w:rFonts w:ascii="Calibri" w:hAnsi="Calibri"/>
-          <w:color w:val="1E293B"/>
-          <w:sz w:val="18"/>
-        </w:rPr>
-        <w:t>Anaheim, CA (/corporate-magician-anaheim | alias: /anaheim)</w:t>
-      </w:r>
-    </w:p>
-    <w:p>
-      <w:pPr>
-        <w:pStyle w:val="ListBullet"/>
-        <w:spacing w:before="20" w:after="40"/>
-      </w:pPr>
-      <w:r>
-        <w:rPr>
-          <w:rFonts w:ascii="Calibri" w:hAnsi="Calibri"/>
-          <w:color w:val="1E293B"/>
-          <w:sz w:val="18"/>
-        </w:rPr>
-        <w:t>Irvine, CA (/corporate-magician-irvine | alias: /irvine)</w:t>
-      </w:r>
-    </w:p>
-    <w:p>
-      <w:pPr>
-        <w:pStyle w:val="ListBullet"/>
-        <w:spacing w:before="20" w:after="40"/>
-      </w:pPr>
-      <w:r>
-        <w:rPr>
-          <w:rFonts w:ascii="Calibri" w:hAnsi="Calibri"/>
-          <w:color w:val="1E293B"/>
-          <w:sz w:val="18"/>
-        </w:rPr>
-        <w:t>Santa Ana, CA (/corporate-magician-santa-ana | alias: /santa-ana)</w:t>
-      </w:r>
-    </w:p>
-    <w:p>
-      <w:pPr>
-        <w:pStyle w:val="ListBullet"/>
-        <w:spacing w:before="20" w:after="40"/>
-      </w:pPr>
-      <w:r>
-        <w:rPr>
-          <w:rFonts w:ascii="Calibri" w:hAnsi="Calibri"/>
-          <w:color w:val="1E293B"/>
-          <w:sz w:val="18"/>
-        </w:rPr>
-        <w:t>Huntington Beach, CA (/corporate-magician-huntington-beach | aliases: /huntington-beach, /hb)</w:t>
-      </w:r>
-    </w:p>
-    <w:p>
-      <w:pPr>
-        <w:pStyle w:val="ListBullet"/>
-        <w:spacing w:before="20" w:after="40"/>
-      </w:pPr>
-      <w:r>
-        <w:rPr>
-          <w:rFonts w:ascii="Calibri" w:hAnsi="Calibri"/>
-          <w:color w:val="1E293B"/>
-          <w:sz w:val="18"/>
-        </w:rPr>
-        <w:t>Garden Grove, CA (/corporate-magician-garden-grove | alias: /garden-grove)</w:t>
-      </w:r>
-    </w:p>
-    <w:p>
-      <w:pPr>
-        <w:spacing w:before="360" w:after="120"/>
-      </w:pPr>
-      <w:r>
-        <w:rPr>
-          <w:rFonts w:ascii="Georgia" w:hAnsi="Georgia"/>
-          <w:b/>
-          <w:color w:val="0A0B0E"/>
-          <w:sz w:val="30"/>
-        </w:rPr>
-        <w:t>4. Technical SEO Infrastructure &amp; CRO Enhancements</w:t>
-      </w:r>
-    </w:p>
-    <w:tbl>
-      <w:tblPr>
-        <w:tblW w:type="auto" w:w="0"/>
-        <w:jc w:val="center"/>
-        <w:tblLayout w:type="fixed"/>
-        <w:tblLook w:firstColumn="1" w:firstRow="1" w:lastColumn="0" w:lastRow="0" w:noHBand="0" w:noVBand="1" w:val="04A0"/>
-        <w:tblBorders>
-          <w:top w:val="single" w:sz="4" w:space="0" w:color="D1D5DB"/>
-          <w:bottom w:val="single" w:sz="4" w:space="0" w:color="D1D5DB"/>
-          <w:insideH w:val="single" w:sz="4" w:space="0" w:color="D1D5DB"/>
-          <w:insideV w:val="none"/>
-          <w:left w:val="none"/>
-          <w:right w:val="none"/>
-        </w:tblBorders>
-      </w:tblPr>
-      <w:tblGrid>
-        <w:gridCol w:w="3120"/>
-        <w:gridCol w:w="3120"/>
-        <w:gridCol w:w="3120"/>
-      </w:tblGrid>
-      <w:tr>
-        <w:tc>
-          <w:tcPr>
-            <w:tcW w:type="dxa" w:w="3120"/>
-            <w:shd w:fill="12141A"/>
-            <w:tcMar>
-              <w:top w:w="140" w:type="dxa"/>
-              <w:bottom w:w="140" w:type="dxa"/>
-              <w:left w:w="140" w:type="dxa"/>
-              <w:right w:w="140" w:type="dxa"/>
-            </w:tcMar>
-          </w:tcPr>
-          <w:p>
-            <w:pPr>
-              <w:spacing w:before="0" w:after="0"/>
-            </w:pPr>
-            <w:r>
-              <w:rPr>
-                <w:rFonts w:ascii="Calibri" w:hAnsi="Calibri"/>
-                <w:b/>
-                <w:color w:val="FFFFFF"/>
-                <w:sz w:val="18"/>
-              </w:rPr>
-              <w:t>FEATURE / INFRASTRUCTURE</w:t>
+              <w:t>FEATURE / ASSET</w:t>
             </w:r>
           </w:p>
         </w:tc>
@@ -1889,7 +850,7 @@
                 <w:color w:val="FFFFFF"/>
                 <w:sz w:val="18"/>
               </w:rPr>
-              <w:t>BUSINESS &amp; BOOKING VALUE</w:t>
+              <w:t>BUSINESS &amp; BOOKING IMPACT</w:t>
             </w:r>
           </w:p>
         </w:tc>
@@ -1923,7 +884,7 @@
         </w:tc>
         <w:tc>
           <w:tcPr>
-            <w:tcW w:type="dxa" w:w="3744"/>
+            <w:tcW w:type="dxa" w:w="3600"/>
             <w:shd w:fill="F8FAFC"/>
             <w:tcMar>
               <w:top w:w="100" w:type="dxa"/>
@@ -1948,7 +909,7 @@
         </w:tc>
         <w:tc>
           <w:tcPr>
-            <w:tcW w:type="dxa" w:w="3024"/>
+            <w:tcW w:type="dxa" w:w="3168"/>
             <w:shd w:fill="F8FAFC"/>
             <w:tcMar>
               <w:top w:w="100" w:type="dxa"/>
@@ -1995,13 +956,13 @@
                 <w:color w:val="0A0B0E"/>
                 <w:sz w:val="18"/>
               </w:rPr>
-              <w:t>43-Brand Enterprise &amp; Institutional Ticker</w:t>
+              <w:t>43-Brand Enterprise Ticker</w:t>
             </w:r>
           </w:p>
         </w:tc>
         <w:tc>
           <w:tcPr>
-            <w:tcW w:type="dxa" w:w="3744"/>
+            <w:tcW w:type="dxa" w:w="3600"/>
             <w:shd w:fill="FFFFFF"/>
             <w:tcMar>
               <w:top w:w="100" w:type="dxa"/>
@@ -2020,13 +981,13 @@
                 <w:color w:val="1E293B"/>
                 <w:sz w:val="18"/>
               </w:rPr>
-              <w:t>Animated marquee featuring UC San Diego Jacobs School, USC, UC Davis, Tournament of Roses, Meta, BMW, Google, Cisco, Sharp, MetLife, etc.</w:t>
+              <w:t>Seamless animated marquee featuring UC San Diego Jacobs School of Engineering, USC, UC Davis, Tournament of Roses, Meta, BMW, Google, Cisco, Sharp, MetLife, etc.</w:t>
             </w:r>
           </w:p>
         </w:tc>
         <w:tc>
           <w:tcPr>
-            <w:tcW w:type="dxa" w:w="3024"/>
+            <w:tcW w:type="dxa" w:w="3168"/>
             <w:shd w:fill="FFFFFF"/>
             <w:tcMar>
               <w:top w:w="100" w:type="dxa"/>
@@ -2079,7 +1040,7 @@
         </w:tc>
         <w:tc>
           <w:tcPr>
-            <w:tcW w:type="dxa" w:w="3744"/>
+            <w:tcW w:type="dxa" w:w="3600"/>
             <w:shd w:fill="F8FAFC"/>
             <w:tcMar>
               <w:top w:w="100" w:type="dxa"/>
@@ -2104,7 +1065,7 @@
         </w:tc>
         <w:tc>
           <w:tcPr>
-            <w:tcW w:type="dxa" w:w="3024"/>
+            <w:tcW w:type="dxa" w:w="3168"/>
             <w:shd w:fill="F8FAFC"/>
             <w:tcMar>
               <w:top w:w="100" w:type="dxa"/>
@@ -2157,7 +1118,7 @@
         </w:tc>
         <w:tc>
           <w:tcPr>
-            <w:tcW w:type="dxa" w:w="3744"/>
+            <w:tcW w:type="dxa" w:w="3600"/>
             <w:shd w:fill="FFFFFF"/>
             <w:tcMar>
               <w:top w:w="100" w:type="dxa"/>
@@ -2182,7 +1143,7 @@
         </w:tc>
         <w:tc>
           <w:tcPr>
-            <w:tcW w:type="dxa" w:w="3024"/>
+            <w:tcW w:type="dxa" w:w="3168"/>
             <w:shd w:fill="FFFFFF"/>
             <w:tcMar>
               <w:top w:w="100" w:type="dxa"/>
@@ -2235,7 +1196,7 @@
         </w:tc>
         <w:tc>
           <w:tcPr>
-            <w:tcW w:type="dxa" w:w="3744"/>
+            <w:tcW w:type="dxa" w:w="3600"/>
             <w:shd w:fill="F8FAFC"/>
             <w:tcMar>
               <w:top w:w="100" w:type="dxa"/>
@@ -2260,7 +1221,7 @@
         </w:tc>
         <w:tc>
           <w:tcPr>
-            <w:tcW w:type="dxa" w:w="3024"/>
+            <w:tcW w:type="dxa" w:w="3168"/>
             <w:shd w:fill="F8FAFC"/>
             <w:tcMar>
               <w:top w:w="100" w:type="dxa"/>
@@ -2313,7 +1274,7 @@
         </w:tc>
         <w:tc>
           <w:tcPr>
-            <w:tcW w:type="dxa" w:w="3744"/>
+            <w:tcW w:type="dxa" w:w="3600"/>
             <w:shd w:fill="FFFFFF"/>
             <w:tcMar>
               <w:top w:w="100" w:type="dxa"/>
@@ -2338,7 +1299,7 @@
         </w:tc>
         <w:tc>
           <w:tcPr>
-            <w:tcW w:type="dxa" w:w="3024"/>
+            <w:tcW w:type="dxa" w:w="3168"/>
             <w:shd w:fill="FFFFFF"/>
             <w:tcMar>
               <w:top w:w="100" w:type="dxa"/>
@@ -2385,13 +1346,13 @@
                 <w:color w:val="0A0B0E"/>
                 <w:sz w:val="18"/>
               </w:rPr>
-              <w:t>35+ 301 Permanent Redirects</w:t>
+              <w:t>Marketing EPK Downloads</w:t>
             </w:r>
           </w:p>
         </w:tc>
         <w:tc>
           <w:tcPr>
-            <w:tcW w:type="dxa" w:w="3744"/>
+            <w:tcW w:type="dxa" w:w="3600"/>
             <w:shd w:fill="F8FAFC"/>
             <w:tcMar>
               <w:top w:w="100" w:type="dxa"/>
@@ -2410,13 +1371,13 @@
                 <w:color w:val="1E293B"/>
                 <w:sz w:val="18"/>
               </w:rPr>
-              <w:t>Clean extensionless URLs (/stage-show, /la, /irvine) &amp; misspelling protection in vercel.json.</w:t>
+              <w:t>One-click download triggers for Marketing Brochure &amp; One-Sheeter PDFs.</w:t>
             </w:r>
           </w:p>
         </w:tc>
         <w:tc>
           <w:tcPr>
-            <w:tcW w:type="dxa" w:w="3024"/>
+            <w:tcW w:type="dxa" w:w="3168"/>
             <w:shd w:fill="F8FAFC"/>
             <w:tcMar>
               <w:top w:w="100" w:type="dxa"/>
@@ -2435,7 +1396,7 @@
                 <w:color w:val="1E293B"/>
                 <w:sz w:val="18"/>
               </w:rPr>
-              <w:t>Prevents 404 broken links, preserves link equity, and supports clean print/EPK URLs.</w:t>
+              <w:t>Enables event planners to immediately share materials with committee members.</w:t>
             </w:r>
           </w:p>
         </w:tc>
@@ -2452,7 +1413,233 @@
           <w:color w:val="0A0B0E"/>
           <w:sz w:val="30"/>
         </w:rPr>
-        <w:t>5. Summary of Deliverables</w:t>
+        <w:t>3. Technical SEO &amp; Internal Linking Network</w:t>
+      </w:r>
+    </w:p>
+    <w:p>
+      <w:pPr>
+        <w:spacing w:before="80" w:after="80"/>
+      </w:pPr>
+      <w:r>
+        <w:rPr>
+          <w:rFonts w:ascii="Calibri" w:hAnsi="Calibri"/>
+          <w:b/>
+          <w:color w:val="1E293B"/>
+          <w:sz w:val="24"/>
+        </w:rPr>
+        <w:t>A. Sitewide Internal Linking Mesh (100% Implemented)</w:t>
+      </w:r>
+    </w:p>
+    <w:p>
+      <w:pPr>
+        <w:pStyle w:val="ListBullet"/>
+        <w:spacing w:before="20" w:after="60"/>
+      </w:pPr>
+      <w:r>
+        <w:rPr>
+          <w:rFonts w:ascii="Calibri" w:hAnsi="Calibri"/>
+          <w:b/>
+          <w:color w:val="0A0B0E"/>
+          <w:sz w:val="19"/>
+        </w:rPr>
+        <w:t xml:space="preserve">Global Footer Navigation: </w:t>
+      </w:r>
+      <w:r>
+        <w:rPr>
+          <w:rFonts w:ascii="Calibri" w:hAnsi="Calibri"/>
+          <w:color w:val="1E293B"/>
+          <w:sz w:val="19"/>
+        </w:rPr>
+        <w:t>Updated Column 2 across all 19 HTML production pages to link directly to /corporate-stage-show, /strolling-mind-reading, /team-building, and /contact; and Popular Hubs to link to all 14 regional hubs.</w:t>
+      </w:r>
+    </w:p>
+    <w:p>
+      <w:pPr>
+        <w:pStyle w:val="ListBullet"/>
+        <w:spacing w:before="20" w:after="60"/>
+      </w:pPr>
+      <w:r>
+        <w:rPr>
+          <w:rFonts w:ascii="Calibri" w:hAnsi="Calibri"/>
+          <w:b/>
+          <w:color w:val="0A0B0E"/>
+          <w:sz w:val="19"/>
+        </w:rPr>
+        <w:t xml:space="preserve">Card-Level Contextual Links: </w:t>
+      </w:r>
+      <w:r>
+        <w:rPr>
+          <w:rFonts w:ascii="Calibri" w:hAnsi="Calibri"/>
+          <w:color w:val="1E293B"/>
+          <w:sz w:val="19"/>
+        </w:rPr>
+        <w:t>Integrated contextual exploration text links ('Explore Stage Show Format →', 'Explore Strolling Mentalism →', 'Explore Team Building Format →') inside Performance Package cards across Homepage and all 14 location pages without altering the instant booking modals.</w:t>
+      </w:r>
+    </w:p>
+    <w:p>
+      <w:pPr>
+        <w:pStyle w:val="ListBullet"/>
+        <w:spacing w:before="20" w:after="60"/>
+      </w:pPr>
+      <w:r>
+        <w:rPr>
+          <w:rFonts w:ascii="Calibri" w:hAnsi="Calibri"/>
+          <w:b/>
+          <w:color w:val="0A0B0E"/>
+          <w:sz w:val="19"/>
+        </w:rPr>
+        <w:t xml:space="preserve">Service Cross-Linking: </w:t>
+      </w:r>
+      <w:r>
+        <w:rPr>
+          <w:rFonts w:ascii="Calibri" w:hAnsi="Calibri"/>
+          <w:color w:val="1E293B"/>
+          <w:sz w:val="19"/>
+        </w:rPr>
+        <w:t>Each service page contains a dedicated 'Complementary Entertainment Formats' grid cross-linking to the other two formats.</w:t>
+      </w:r>
+    </w:p>
+    <w:p>
+      <w:pPr>
+        <w:pStyle w:val="ListBullet"/>
+        <w:spacing w:before="20" w:after="60"/>
+      </w:pPr>
+      <w:r>
+        <w:rPr>
+          <w:rFonts w:ascii="Calibri" w:hAnsi="Calibri"/>
+          <w:b/>
+          <w:color w:val="0A0B0E"/>
+          <w:sz w:val="19"/>
+        </w:rPr>
+        <w:t xml:space="preserve">Geographic Service Anchor Links: </w:t>
+      </w:r>
+      <w:r>
+        <w:rPr>
+          <w:rFonts w:ascii="Calibri" w:hAnsi="Calibri"/>
+          <w:color w:val="1E293B"/>
+          <w:sz w:val="19"/>
+        </w:rPr>
+        <w:t>Service pages link down into major regional convention hubs (Los Angeles, San Diego, Irvine, Anaheim, San Francisco, Phoenix, Scottsdale).</w:t>
+      </w:r>
+    </w:p>
+    <w:p>
+      <w:pPr>
+        <w:pStyle w:val="ListBullet"/>
+        <w:spacing w:before="20" w:after="60"/>
+      </w:pPr>
+      <w:r>
+        <w:rPr>
+          <w:rFonts w:ascii="Calibri" w:hAnsi="Calibri"/>
+          <w:b/>
+          <w:color w:val="0A0B0E"/>
+          <w:sz w:val="19"/>
+        </w:rPr>
+        <w:t xml:space="preserve">Breadcrumb Navigation: </w:t>
+      </w:r>
+      <w:r>
+        <w:rPr>
+          <w:rFonts w:ascii="Calibri" w:hAnsi="Calibri"/>
+          <w:color w:val="1E293B"/>
+          <w:sz w:val="19"/>
+        </w:rPr>
+        <w:t>Implemented hierarchical breadcrumb navigation (Home &gt; Entertainment Options &gt; [Service]) with schema markup across all interior pages.</w:t>
+      </w:r>
+    </w:p>
+    <w:p>
+      <w:pPr>
+        <w:spacing w:before="200" w:after="80"/>
+      </w:pPr>
+      <w:r>
+        <w:rPr>
+          <w:rFonts w:ascii="Calibri" w:hAnsi="Calibri"/>
+          <w:b/>
+          <w:color w:val="1E293B"/>
+          <w:sz w:val="24"/>
+        </w:rPr>
+        <w:t>B. Structured Data, Routing &amp; Site Hygiene</w:t>
+      </w:r>
+    </w:p>
+    <w:p>
+      <w:pPr>
+        <w:pStyle w:val="ListBullet"/>
+        <w:spacing w:before="20" w:after="60"/>
+      </w:pPr>
+      <w:r>
+        <w:rPr>
+          <w:rFonts w:ascii="Calibri" w:hAnsi="Calibri"/>
+          <w:b/>
+          <w:color w:val="0A0B0E"/>
+          <w:sz w:val="19"/>
+        </w:rPr>
+        <w:t xml:space="preserve">Schema.org JSON-LD: </w:t>
+      </w:r>
+      <w:r>
+        <w:rPr>
+          <w:rFonts w:ascii="Calibri" w:hAnsi="Calibri"/>
+          <w:color w:val="1E293B"/>
+          <w:sz w:val="19"/>
+        </w:rPr>
+        <w:t>Implemented Person, EntertainmentBusiness, Service, Place, FAQPage, and GeoCoordinates structured data across all 19 pages.</w:t>
+      </w:r>
+    </w:p>
+    <w:p>
+      <w:pPr>
+        <w:pStyle w:val="ListBullet"/>
+        <w:spacing w:before="20" w:after="60"/>
+      </w:pPr>
+      <w:r>
+        <w:rPr>
+          <w:rFonts w:ascii="Calibri" w:hAnsi="Calibri"/>
+          <w:b/>
+          <w:color w:val="0A0B0E"/>
+          <w:sz w:val="19"/>
+        </w:rPr>
+        <w:t xml:space="preserve">Clean URLs &amp; 50+ 301 Redirects: </w:t>
+      </w:r>
+      <w:r>
+        <w:rPr>
+          <w:rFonts w:ascii="Calibri" w:hAnsi="Calibri"/>
+          <w:color w:val="1E293B"/>
+          <w:sz w:val="19"/>
+        </w:rPr>
+        <w:t>Configured in vercel.json to support clean extensionless URLs (/stage-show, /la, /irvine, /newport, /ps, /pd, /napa) and automatically catch common misspellings.</w:t>
+      </w:r>
+    </w:p>
+    <w:p>
+      <w:pPr>
+        <w:pStyle w:val="ListBullet"/>
+        <w:spacing w:before="20" w:after="60"/>
+      </w:pPr>
+      <w:r>
+        <w:rPr>
+          <w:rFonts w:ascii="Calibri" w:hAnsi="Calibri"/>
+          <w:b/>
+          <w:color w:val="0A0B0E"/>
+          <w:sz w:val="19"/>
+        </w:rPr>
+        <w:t xml:space="preserve">Sitemap &amp; Canonical Hygiene: </w:t>
+      </w:r>
+      <w:r>
+        <w:rPr>
+          <w:rFonts w:ascii="Calibri" w:hAnsi="Calibri"/>
+          <w:color w:val="1E293B"/>
+          <w:sz w:val="19"/>
+        </w:rPr>
+        <w:t>All 19 active URLs indexed in sitemap.xml with prioritized crawl weights (1.0 home, 0.9 services, 0.8 locations) and self-referencing canonical tags.</w:t>
+      </w:r>
+    </w:p>
+    <w:p>
+      <w:pPr>
+        <w:spacing w:before="360" w:after="120"/>
+      </w:pPr>
+      <w:r>
+        <w:rPr>
+          <w:rFonts w:ascii="Georgia" w:hAnsi="Georgia"/>
+          <w:b/>
+          <w:color w:val="0A0B0E"/>
+          <w:sz w:val="30"/>
+        </w:rPr>
+        <w:t>4. Summary of Deliverables</w:t>
       </w:r>
     </w:p>
     <w:tbl>
@@ -2603,7 +1790,7 @@
                 <w:color w:val="1E293B"/>
                 <w:sz w:val="18"/>
               </w:rPr>
-              <w:t>15 Pages</w:t>
+              <w:t>19 Pages</w:t>
             </w:r>
           </w:p>
         </w:tc>
@@ -2682,7 +1869,7 @@
                 <w:color w:val="1E293B"/>
                 <w:sz w:val="18"/>
               </w:rPr>
-              <w:t>15 Custom Titles</w:t>
+              <w:t>19 Custom Titles</w:t>
             </w:r>
           </w:p>
         </w:tc>
@@ -2708,7 +1895,7 @@
                 <w:color w:val="10B981"/>
                 <w:sz w:val="18"/>
               </w:rPr>
-              <w:t>Live Across 15 Pages</w:t>
+              <w:t>Live Across 19 Pages</w:t>
             </w:r>
           </w:p>
         </w:tc>
@@ -2761,7 +1948,7 @@
                 <w:color w:val="1E293B"/>
                 <w:sz w:val="18"/>
               </w:rPr>
-              <w:t>15 Custom Descriptions</w:t>
+              <w:t>19 Custom Descriptions</w:t>
             </w:r>
           </w:p>
         </w:tc>
@@ -2787,7 +1974,7 @@
                 <w:color w:val="10B981"/>
                 <w:sz w:val="18"/>
               </w:rPr>
-              <w:t>Live Across 15 Pages</w:t>
+              <w:t>Live Across 19 Pages</w:t>
             </w:r>
           </w:p>
         </w:tc>
@@ -2919,7 +2106,7 @@
                 <w:color w:val="1E293B"/>
                 <w:sz w:val="18"/>
               </w:rPr>
-              <w:t>10 Dedicated Pages</w:t>
+              <w:t>14 Dedicated Pages</w:t>
             </w:r>
           </w:p>
         </w:tc>
@@ -2998,7 +2185,7 @@
                 <w:color w:val="1E293B"/>
                 <w:sz w:val="18"/>
               </w:rPr>
-              <w:t>150+ Structured Links</w:t>
+              <w:t>200+ Structured Links</w:t>
             </w:r>
           </w:p>
         </w:tc>
@@ -3024,7 +2211,7 @@
                 <w:color w:val="10B981"/>
                 <w:sz w:val="18"/>
               </w:rPr>
-              <w:t>Live Across 15 Pages</w:t>
+              <w:t>Live Across 19 Pages</w:t>
             </w:r>
           </w:p>
         </w:tc>
@@ -3052,7 +2239,7 @@
                 <w:color w:val="0A0B0E"/>
                 <w:sz w:val="18"/>
               </w:rPr>
-              <w:t>Verified Enterprise &amp; Institutional Logos</w:t>
+              <w:t>Verified Enterprise Client Logos</w:t>
             </w:r>
           </w:p>
         </w:tc>
@@ -3393,7 +2580,7 @@
                 <w:color w:val="1E293B"/>
                 <w:sz w:val="18"/>
               </w:rPr>
-              <w:t>35+ Permanent Rules</w:t>
+              <w:t>50+ Permanent Rules</w:t>
             </w:r>
           </w:p>
         </w:tc>
@@ -3498,7 +2685,7 @@
                 <w:color w:val="10B981"/>
                 <w:sz w:val="18"/>
               </w:rPr>
-              <w:t>Deployed Across 15 Pages</w:t>
+              <w:t>Deployed Across 19 Pages</w:t>
             </w:r>
           </w:p>
         </w:tc>

</xml_diff>

<commit_message>
Add Orange County landing page, update sitemap, redirects, and add Orange County to footer across all pages
</commit_message>
<xml_diff>
--- a/Monthly_SEO_and_Site_Building_Report_September_2026.docx
+++ b/Monthly_SEO_and_Site_Building_Report_September_2026.docx
@@ -236,7 +236,7 @@
           <w:color w:val="1E293B"/>
           <w:sz w:val="21"/>
         </w:rPr>
-        <w:t>During September 2026, the digital presence for Adrian Saint – Corporate Mentalist &amp; Mind Reader underwent a comprehensive architectural transformation. The web platform was expanded from a single landing page into a full-scale, enterprise-ready corporate lead generation ecosystem consisting of 19 fully optimized production pages. Every page was built with conversion rate optimization (CRO), bespoke Schema.org JSON-LD structured data, responsive mobile engineering, and a complete sitewide internal linking network designed to maximize organic Google search rankings across Southern California, the Desert Resorts, California Wine Country, and the greater Southwest.</w:t>
+        <w:t>During September 2026, the digital presence for Adrian Saint – Corporate Mentalist &amp; Mind Reader underwent a comprehensive architectural transformation. The web platform was expanded from a single landing page into a full-scale, enterprise-ready corporate lead generation ecosystem consisting of 20 fully optimized production pages. Every page was built with conversion rate optimization (CRO), bespoke Schema.org JSON-LD structured data, responsive mobile engineering, and a complete sitewide internal linking network designed to maximize organic Google search rankings across Southern California, the Desert Resorts, California Wine Country, and the greater Southwest.</w:t>
       </w:r>
     </w:p>
     <w:tbl>
@@ -283,7 +283,7 @@
                 <w:color w:val="C5A059"/>
                 <w:sz w:val="40"/>
               </w:rPr>
-              <w:t>19</w:t>
+              <w:t>20</w:t>
               <w:br/>
             </w:r>
             <w:r>
@@ -320,7 +320,7 @@
                 <w:color w:val="C5A059"/>
                 <w:sz w:val="40"/>
               </w:rPr>
-              <w:t>14</w:t>
+              <w:t>15</w:t>
               <w:br/>
             </w:r>
             <w:r>
@@ -357,7 +357,7 @@
                 <w:color w:val="C5A059"/>
                 <w:sz w:val="40"/>
               </w:rPr>
-              <w:t>200+</w:t>
+              <w:t>220+</w:t>
               <w:br/>
             </w:r>
             <w:r>
@@ -515,7 +515,7 @@
           <w:color w:val="1E293B"/>
           <w:sz w:val="24"/>
         </w:rPr>
-        <w:t>B. Regional Local SEO Hubs (14 Target Municipalities)</w:t>
+        <w:t>B. Regional Local SEO Hubs (15 Target Municipalities)</w:t>
       </w:r>
     </w:p>
     <w:p>
@@ -528,7 +528,21 @@
           <w:color w:val="1E293B"/>
           <w:sz w:val="20"/>
         </w:rPr>
-        <w:t>Built and deployed 14 dedicated local landing pages engineered to dominate Google organic and local queries for corporate entertainment:</w:t>
+        <w:t>Built and deployed 15 dedicated local landing pages engineered to dominate Google organic and local queries for corporate entertainment:</w:t>
+      </w:r>
+    </w:p>
+    <w:p>
+      <w:pPr>
+        <w:pStyle w:val="ListBullet"/>
+        <w:spacing w:before="20" w:after="40"/>
+      </w:pPr>
+      <w:r>
+        <w:rPr>
+          <w:rFonts w:ascii="Calibri" w:hAnsi="Calibri"/>
+          <w:color w:val="1E293B"/>
+          <w:sz w:val="19"/>
+        </w:rPr>
+        <w:t>Orange County, CA (/corporate-magician-orange-county | aliases: /orange-county, /oc)</w:t>
       </w:r>
     </w:p>
     <w:p>
@@ -1450,7 +1464,7 @@
           <w:color w:val="1E293B"/>
           <w:sz w:val="19"/>
         </w:rPr>
-        <w:t>Updated Column 2 across all 19 HTML production pages to link directly to /corporate-stage-show, /strolling-mind-reading, /team-building, and /contact; and Popular Hubs to link to all 14 regional hubs.</w:t>
+        <w:t>Updated Column 2 across all 20 HTML production pages to link directly to /corporate-stage-show, /strolling-mind-reading, /team-building, and /contact; and Popular Hubs to link to all 14 regional hubs.</w:t>
       </w:r>
     </w:p>
     <w:p>
@@ -1473,7 +1487,7 @@
           <w:color w:val="1E293B"/>
           <w:sz w:val="19"/>
         </w:rPr>
-        <w:t>Integrated contextual exploration text links ('Explore Stage Show Format →', 'Explore Strolling Mentalism →', 'Explore Team Building Format →') inside Performance Package cards across Homepage and all 14 location pages without altering the instant booking modals.</w:t>
+        <w:t>Integrated contextual exploration text links ('Explore Stage Show Format →', 'Explore Strolling Mentalism →', 'Explore Team Building Format →') inside Performance Package cards across Homepage and all 15 location pages without altering the instant booking modals.</w:t>
       </w:r>
     </w:p>
     <w:p>
@@ -1579,7 +1593,7 @@
           <w:color w:val="1E293B"/>
           <w:sz w:val="19"/>
         </w:rPr>
-        <w:t>Implemented Person, EntertainmentBusiness, Service, Place, FAQPage, and GeoCoordinates structured data across all 19 pages.</w:t>
+        <w:t>Implemented Person, EntertainmentBusiness, Service, Place, FAQPage, and GeoCoordinates structured data across all 20 pages.</w:t>
       </w:r>
     </w:p>
     <w:p>
@@ -1625,7 +1639,7 @@
           <w:color w:val="1E293B"/>
           <w:sz w:val="19"/>
         </w:rPr>
-        <w:t>All 19 active URLs indexed in sitemap.xml with prioritized crawl weights (1.0 home, 0.9 services, 0.8 locations) and self-referencing canonical tags.</w:t>
+        <w:t>All 20 active URLs indexed in sitemap.xml with prioritized crawl weights (1.0 home, 0.9 services, 0.8 locations) and self-referencing canonical tags.</w:t>
       </w:r>
     </w:p>
     <w:p>
@@ -1790,7 +1804,7 @@
                 <w:color w:val="1E293B"/>
                 <w:sz w:val="18"/>
               </w:rPr>
-              <w:t>19 Pages</w:t>
+              <w:t>20 Pages</w:t>
             </w:r>
           </w:p>
         </w:tc>
@@ -1869,7 +1883,7 @@
                 <w:color w:val="1E293B"/>
                 <w:sz w:val="18"/>
               </w:rPr>
-              <w:t>19 Custom Titles</w:t>
+              <w:t>20 Custom Titles</w:t>
             </w:r>
           </w:p>
         </w:tc>
@@ -1895,7 +1909,7 @@
                 <w:color w:val="10B981"/>
                 <w:sz w:val="18"/>
               </w:rPr>
-              <w:t>Live Across 19 Pages</w:t>
+              <w:t>Live Across 20 Pages</w:t>
             </w:r>
           </w:p>
         </w:tc>
@@ -1948,7 +1962,7 @@
                 <w:color w:val="1E293B"/>
                 <w:sz w:val="18"/>
               </w:rPr>
-              <w:t>19 Custom Descriptions</w:t>
+              <w:t>20 Custom Descriptions</w:t>
             </w:r>
           </w:p>
         </w:tc>
@@ -1974,7 +1988,7 @@
                 <w:color w:val="10B981"/>
                 <w:sz w:val="18"/>
               </w:rPr>
-              <w:t>Live Across 19 Pages</w:t>
+              <w:t>Live Across 20 Pages</w:t>
             </w:r>
           </w:p>
         </w:tc>
@@ -2106,7 +2120,7 @@
                 <w:color w:val="1E293B"/>
                 <w:sz w:val="18"/>
               </w:rPr>
-              <w:t>14 Dedicated Pages</w:t>
+              <w:t>15 Dedicated Pages</w:t>
             </w:r>
           </w:p>
         </w:tc>
@@ -2185,7 +2199,7 @@
                 <w:color w:val="1E293B"/>
                 <w:sz w:val="18"/>
               </w:rPr>
-              <w:t>200+ Structured Links</w:t>
+              <w:t>220+ Structured Links</w:t>
             </w:r>
           </w:p>
         </w:tc>
@@ -2211,7 +2225,7 @@
                 <w:color w:val="10B981"/>
                 <w:sz w:val="18"/>
               </w:rPr>
-              <w:t>Live Across 19 Pages</w:t>
+              <w:t>Live Across 20 Pages</w:t>
             </w:r>
           </w:p>
         </w:tc>
@@ -2685,7 +2699,7 @@
                 <w:color w:val="10B981"/>
                 <w:sz w:val="18"/>
               </w:rPr>
-              <w:t>Deployed Across 19 Pages</w:t>
+              <w:t>Deployed Across 20 Pages</w:t>
             </w:r>
           </w:p>
         </w:tc>

</xml_diff>

<commit_message>
Add location pages for Beverly Hills, Santa Monica, Santa Barbara, Temecula, and Las Vegas with 301 redirects and sitemap entries
</commit_message>
<xml_diff>
--- a/Monthly_SEO_and_Site_Building_Report_September_2026.docx
+++ b/Monthly_SEO_and_Site_Building_Report_September_2026.docx
@@ -236,7 +236,7 @@
           <w:color w:val="1E293B"/>
           <w:sz w:val="21"/>
         </w:rPr>
-        <w:t>During September 2026, the digital presence for Adrian Saint – Corporate Mentalist &amp; Mind Reader underwent a comprehensive architectural transformation. The web platform was expanded from a single landing page into a full-scale, enterprise-ready corporate lead generation ecosystem consisting of 20 fully optimized production pages. Every page was built with conversion rate optimization (CRO), bespoke Schema.org JSON-LD structured data, responsive mobile engineering, and a complete sitewide internal linking network designed to maximize organic Google search rankings across Southern California, the Desert Resorts, California Wine Country, and the greater Southwest.</w:t>
+        <w:t>During September 2026, the digital presence for Adrian Saint – Corporate Mentalist &amp; Mind Reader underwent a comprehensive architectural transformation. The web platform was expanded from a single landing page into a full-scale, enterprise-ready corporate lead generation ecosystem consisting of 25 fully optimized production pages. Every page was built with conversion rate optimization (CRO), bespoke Schema.org JSON-LD structured data, responsive mobile engineering, and a complete sitewide internal linking network designed to maximize organic Google search rankings across Southern California, the Desert Resorts, California Wine Country, and the greater Southwest.</w:t>
       </w:r>
     </w:p>
     <w:tbl>
@@ -283,7 +283,7 @@
                 <w:color w:val="C5A059"/>
                 <w:sz w:val="40"/>
               </w:rPr>
-              <w:t>20</w:t>
+              <w:t>25</w:t>
               <w:br/>
             </w:r>
             <w:r>
@@ -320,7 +320,7 @@
                 <w:color w:val="C5A059"/>
                 <w:sz w:val="40"/>
               </w:rPr>
-              <w:t>15</w:t>
+              <w:t>20</w:t>
               <w:br/>
             </w:r>
             <w:r>
@@ -357,7 +357,7 @@
                 <w:color w:val="C5A059"/>
                 <w:sz w:val="40"/>
               </w:rPr>
-              <w:t>220+</w:t>
+              <w:t>270+</w:t>
               <w:br/>
             </w:r>
             <w:r>
@@ -515,7 +515,7 @@
           <w:color w:val="1E293B"/>
           <w:sz w:val="24"/>
         </w:rPr>
-        <w:t>B. Regional Local SEO Hubs (15 Target Municipalities)</w:t>
+        <w:t>B. Regional Local SEO Hubs (20 Target Municipalities)</w:t>
       </w:r>
     </w:p>
     <w:p>
@@ -528,7 +528,7 @@
           <w:color w:val="1E293B"/>
           <w:sz w:val="20"/>
         </w:rPr>
-        <w:t>Built and deployed 15 dedicated local landing pages engineered to dominate Google organic and local queries for corporate entertainment:</w:t>
+        <w:t>Built and deployed 20 dedicated local landing pages engineered to dominate Google organic and local queries for corporate entertainment:</w:t>
       </w:r>
     </w:p>
     <w:p>
@@ -739,6 +739,76 @@
           <w:sz w:val="19"/>
         </w:rPr>
         <w:t>Napa Valley, CA (/corporate-magician-napa | aliases: /napa, /napa-valley, /wine-country)</w:t>
+      </w:r>
+    </w:p>
+    <w:p>
+      <w:pPr>
+        <w:pStyle w:val="ListBullet"/>
+        <w:spacing w:before="20" w:after="40"/>
+      </w:pPr>
+      <w:r>
+        <w:rPr>
+          <w:rFonts w:ascii="Calibri" w:hAnsi="Calibri"/>
+          <w:color w:val="1E293B"/>
+          <w:sz w:val="19"/>
+        </w:rPr>
+        <w:t>Beverly Hills, CA (/corporate-magician-beverly-hills | aliases: /beverly-hills, /bh)</w:t>
+      </w:r>
+    </w:p>
+    <w:p>
+      <w:pPr>
+        <w:pStyle w:val="ListBullet"/>
+        <w:spacing w:before="20" w:after="40"/>
+      </w:pPr>
+      <w:r>
+        <w:rPr>
+          <w:rFonts w:ascii="Calibri" w:hAnsi="Calibri"/>
+          <w:color w:val="1E293B"/>
+          <w:sz w:val="19"/>
+        </w:rPr>
+        <w:t>Santa Monica, CA (/corporate-magician-santa-monica | aliases: /santa-monica, /sm)</w:t>
+      </w:r>
+    </w:p>
+    <w:p>
+      <w:pPr>
+        <w:pStyle w:val="ListBullet"/>
+        <w:spacing w:before="20" w:after="40"/>
+      </w:pPr>
+      <w:r>
+        <w:rPr>
+          <w:rFonts w:ascii="Calibri" w:hAnsi="Calibri"/>
+          <w:color w:val="1E293B"/>
+          <w:sz w:val="19"/>
+        </w:rPr>
+        <w:t>Santa Barbara, CA (/corporate-magician-santa-barbara | aliases: /santa-barbara, /sb)</w:t>
+      </w:r>
+    </w:p>
+    <w:p>
+      <w:pPr>
+        <w:pStyle w:val="ListBullet"/>
+        <w:spacing w:before="20" w:after="40"/>
+      </w:pPr>
+      <w:r>
+        <w:rPr>
+          <w:rFonts w:ascii="Calibri" w:hAnsi="Calibri"/>
+          <w:color w:val="1E293B"/>
+          <w:sz w:val="19"/>
+        </w:rPr>
+        <w:t>Temecula, CA (/corporate-magician-temecula | aliases: /temecula, /temecula-wine-country)</w:t>
+      </w:r>
+    </w:p>
+    <w:p>
+      <w:pPr>
+        <w:pStyle w:val="ListBullet"/>
+        <w:spacing w:before="20" w:after="40"/>
+      </w:pPr>
+      <w:r>
+        <w:rPr>
+          <w:rFonts w:ascii="Calibri" w:hAnsi="Calibri"/>
+          <w:color w:val="1E293B"/>
+          <w:sz w:val="19"/>
+        </w:rPr>
+        <w:t>Las Vegas, NV (/corporate-magician-las-vegas | aliases: /las-vegas, /vegas, /lv)</w:t>
       </w:r>
     </w:p>
     <w:p>
@@ -1464,7 +1534,7 @@
           <w:color w:val="1E293B"/>
           <w:sz w:val="19"/>
         </w:rPr>
-        <w:t>Updated Column 2 across all 20 HTML production pages to link directly to /corporate-stage-show, /strolling-mind-reading, /team-building, and /contact; and Popular Hubs to link to all 14 regional hubs.</w:t>
+        <w:t>Updated Column 2 across all 25 HTML production pages to link directly to /corporate-stage-show, /strolling-mind-reading, /team-building, and /contact; and Popular Hubs to link to all 14 regional hubs.</w:t>
       </w:r>
     </w:p>
     <w:p>
@@ -1487,7 +1557,7 @@
           <w:color w:val="1E293B"/>
           <w:sz w:val="19"/>
         </w:rPr>
-        <w:t>Integrated contextual exploration text links ('Explore Stage Show Format →', 'Explore Strolling Mentalism →', 'Explore Team Building Format →') inside Performance Package cards across Homepage and all 15 location pages without altering the instant booking modals.</w:t>
+        <w:t>Integrated contextual exploration text links ('Explore Stage Show Format →', 'Explore Strolling Mentalism →', 'Explore Team Building Format →') inside Performance Package cards across Homepage and all 20 location pages without altering the instant booking modals.</w:t>
       </w:r>
     </w:p>
     <w:p>
@@ -1593,7 +1663,7 @@
           <w:color w:val="1E293B"/>
           <w:sz w:val="19"/>
         </w:rPr>
-        <w:t>Implemented Person, EntertainmentBusiness, Service, Place, FAQPage, and GeoCoordinates structured data across all 20 pages.</w:t>
+        <w:t>Implemented Person, EntertainmentBusiness, Service, Place, FAQPage, and GeoCoordinates structured data across all 25 pages.</w:t>
       </w:r>
     </w:p>
     <w:p>
@@ -1639,7 +1709,7 @@
           <w:color w:val="1E293B"/>
           <w:sz w:val="19"/>
         </w:rPr>
-        <w:t>All 20 active URLs indexed in sitemap.xml with prioritized crawl weights (1.0 home, 0.9 services, 0.8 locations) and self-referencing canonical tags.</w:t>
+        <w:t>All 25 active URLs indexed in sitemap.xml with prioritized crawl weights (1.0 home, 0.9 services, 0.8 locations) and self-referencing canonical tags.</w:t>
       </w:r>
     </w:p>
     <w:p>
@@ -1804,7 +1874,7 @@
                 <w:color w:val="1E293B"/>
                 <w:sz w:val="18"/>
               </w:rPr>
-              <w:t>20 Pages</w:t>
+              <w:t>25 Pages</w:t>
             </w:r>
           </w:p>
         </w:tc>
@@ -1883,7 +1953,7 @@
                 <w:color w:val="1E293B"/>
                 <w:sz w:val="18"/>
               </w:rPr>
-              <w:t>20 Custom Titles</w:t>
+              <w:t>25 Custom Titles</w:t>
             </w:r>
           </w:p>
         </w:tc>
@@ -1909,7 +1979,7 @@
                 <w:color w:val="10B981"/>
                 <w:sz w:val="18"/>
               </w:rPr>
-              <w:t>Live Across 20 Pages</w:t>
+              <w:t>Live Across 25 Pages</w:t>
             </w:r>
           </w:p>
         </w:tc>
@@ -1962,7 +2032,7 @@
                 <w:color w:val="1E293B"/>
                 <w:sz w:val="18"/>
               </w:rPr>
-              <w:t>20 Custom Descriptions</w:t>
+              <w:t>25 Custom Descriptions</w:t>
             </w:r>
           </w:p>
         </w:tc>
@@ -1988,7 +2058,7 @@
                 <w:color w:val="10B981"/>
                 <w:sz w:val="18"/>
               </w:rPr>
-              <w:t>Live Across 20 Pages</w:t>
+              <w:t>Live Across 25 Pages</w:t>
             </w:r>
           </w:p>
         </w:tc>
@@ -2120,7 +2190,7 @@
                 <w:color w:val="1E293B"/>
                 <w:sz w:val="18"/>
               </w:rPr>
-              <w:t>15 Dedicated Pages</w:t>
+              <w:t>20 Dedicated Pages</w:t>
             </w:r>
           </w:p>
         </w:tc>
@@ -2199,7 +2269,7 @@
                 <w:color w:val="1E293B"/>
                 <w:sz w:val="18"/>
               </w:rPr>
-              <w:t>220+ Structured Links</w:t>
+              <w:t>270+ Structured Links</w:t>
             </w:r>
           </w:p>
         </w:tc>
@@ -2225,7 +2295,7 @@
                 <w:color w:val="10B981"/>
                 <w:sz w:val="18"/>
               </w:rPr>
-              <w:t>Live Across 20 Pages</w:t>
+              <w:t>Live Across 25 Pages</w:t>
             </w:r>
           </w:p>
         </w:tc>
@@ -2699,7 +2769,7 @@
                 <w:color w:val="10B981"/>
                 <w:sz w:val="18"/>
               </w:rPr>
-              <w:t>Deployed Across 20 Pages</w:t>
+              <w:t>Deployed Across 25 Pages</w:t>
             </w:r>
           </w:p>
         </w:tc>

</xml_diff>

<commit_message>
Add Orlando FL location page with dedicated phone 1 (689) 388-7534, 301 redirects, and sitemap entry
</commit_message>
<xml_diff>
--- a/Monthly_SEO_and_Site_Building_Report_September_2026.docx
+++ b/Monthly_SEO_and_Site_Building_Report_September_2026.docx
@@ -236,7 +236,7 @@
           <w:color w:val="1E293B"/>
           <w:sz w:val="21"/>
         </w:rPr>
-        <w:t>During September 2026, the digital presence for Adrian Saint – Corporate Mentalist &amp; Mind Reader underwent a comprehensive architectural transformation. The web platform was expanded from a single landing page into a full-scale, enterprise-ready corporate lead generation ecosystem consisting of 25 fully optimized production pages. Every page was built with conversion rate optimization (CRO), bespoke Schema.org JSON-LD structured data, responsive mobile engineering, and a complete sitewide internal linking network designed to maximize organic Google search rankings across Southern California, the Desert Resorts, California Wine Country, and the greater Southwest.</w:t>
+        <w:t>During September 2026, the digital presence for Adrian Saint – Corporate Mentalist &amp; Mind Reader underwent a comprehensive architectural transformation. The web platform was expanded from a single landing page into a full-scale, enterprise-ready corporate lead generation ecosystem consisting of 26 fully optimized production pages. Every page was built with conversion rate optimization (CRO), bespoke Schema.org JSON-LD structured data, responsive mobile engineering, and a complete sitewide internal linking network designed to maximize organic Google search rankings across Southern California, the Desert Resorts, California Wine Country, and the greater Southwest.</w:t>
       </w:r>
     </w:p>
     <w:tbl>
@@ -283,7 +283,7 @@
                 <w:color w:val="C5A059"/>
                 <w:sz w:val="40"/>
               </w:rPr>
-              <w:t>25</w:t>
+              <w:t>26</w:t>
               <w:br/>
             </w:r>
             <w:r>
@@ -320,7 +320,7 @@
                 <w:color w:val="C5A059"/>
                 <w:sz w:val="40"/>
               </w:rPr>
-              <w:t>20</w:t>
+              <w:t>21</w:t>
               <w:br/>
             </w:r>
             <w:r>
@@ -357,7 +357,7 @@
                 <w:color w:val="C5A059"/>
                 <w:sz w:val="40"/>
               </w:rPr>
-              <w:t>270+</w:t>
+              <w:t>280+</w:t>
               <w:br/>
             </w:r>
             <w:r>
@@ -515,7 +515,7 @@
           <w:color w:val="1E293B"/>
           <w:sz w:val="24"/>
         </w:rPr>
-        <w:t>B. Regional Local SEO Hubs (20 Target Municipalities)</w:t>
+        <w:t>B. Regional Local SEO Hubs (21 Target Municipalities)</w:t>
       </w:r>
     </w:p>
     <w:p>
@@ -528,7 +528,7 @@
           <w:color w:val="1E293B"/>
           <w:sz w:val="20"/>
         </w:rPr>
-        <w:t>Built and deployed 20 dedicated local landing pages engineered to dominate Google organic and local queries for corporate entertainment:</w:t>
+        <w:t>Built and deployed 21 dedicated local landing pages engineered to dominate Google organic and local queries for corporate entertainment:</w:t>
       </w:r>
     </w:p>
     <w:p>
@@ -809,6 +809,20 @@
           <w:sz w:val="19"/>
         </w:rPr>
         <w:t>Las Vegas, NV (/corporate-magician-las-vegas | aliases: /las-vegas, /vegas, /lv)</w:t>
+      </w:r>
+    </w:p>
+    <w:p>
+      <w:pPr>
+        <w:pStyle w:val="ListBullet"/>
+        <w:spacing w:before="20" w:after="40"/>
+      </w:pPr>
+      <w:r>
+        <w:rPr>
+          <w:rFonts w:ascii="Calibri" w:hAnsi="Calibri"/>
+          <w:color w:val="1E293B"/>
+          <w:sz w:val="19"/>
+        </w:rPr>
+        <w:t>Orlando, FL (/corporate-magician-orlando | aliases: /orlando, /orlando-fl | direct phone: 1 (689) 388-7534)</w:t>
       </w:r>
     </w:p>
     <w:p>
@@ -1534,7 +1548,7 @@
           <w:color w:val="1E293B"/>
           <w:sz w:val="19"/>
         </w:rPr>
-        <w:t>Updated Column 2 across all 25 HTML production pages to link directly to /corporate-stage-show, /strolling-mind-reading, /team-building, and /contact; and Popular Hubs to link to all 14 regional hubs.</w:t>
+        <w:t>Updated Column 2 across all 26 HTML production pages to link directly to /corporate-stage-show, /strolling-mind-reading, /team-building, and /contact; and Popular Hubs to link to all 14 regional hubs.</w:t>
       </w:r>
     </w:p>
     <w:p>
@@ -1557,7 +1571,7 @@
           <w:color w:val="1E293B"/>
           <w:sz w:val="19"/>
         </w:rPr>
-        <w:t>Integrated contextual exploration text links ('Explore Stage Show Format →', 'Explore Strolling Mentalism →', 'Explore Team Building Format →') inside Performance Package cards across Homepage and all 20 location pages without altering the instant booking modals.</w:t>
+        <w:t>Integrated contextual exploration text links ('Explore Stage Show Format →', 'Explore Strolling Mentalism →', 'Explore Team Building Format →') inside Performance Package cards across Homepage and all 21 location pages without altering the instant booking modals.</w:t>
       </w:r>
     </w:p>
     <w:p>
@@ -1663,7 +1677,7 @@
           <w:color w:val="1E293B"/>
           <w:sz w:val="19"/>
         </w:rPr>
-        <w:t>Implemented Person, EntertainmentBusiness, Service, Place, FAQPage, and GeoCoordinates structured data across all 25 pages.</w:t>
+        <w:t>Implemented Person, EntertainmentBusiness, Service, Place, FAQPage, and GeoCoordinates structured data across all 26 pages.</w:t>
       </w:r>
     </w:p>
     <w:p>
@@ -1709,7 +1723,7 @@
           <w:color w:val="1E293B"/>
           <w:sz w:val="19"/>
         </w:rPr>
-        <w:t>All 25 active URLs indexed in sitemap.xml with prioritized crawl weights (1.0 home, 0.9 services, 0.8 locations) and self-referencing canonical tags.</w:t>
+        <w:t>All 26 active URLs indexed in sitemap.xml with prioritized crawl weights (1.0 home, 0.9 services, 0.8 locations) and self-referencing canonical tags.</w:t>
       </w:r>
     </w:p>
     <w:p>
@@ -1874,7 +1888,7 @@
                 <w:color w:val="1E293B"/>
                 <w:sz w:val="18"/>
               </w:rPr>
-              <w:t>25 Pages</w:t>
+              <w:t>26 Pages</w:t>
             </w:r>
           </w:p>
         </w:tc>
@@ -1953,7 +1967,7 @@
                 <w:color w:val="1E293B"/>
                 <w:sz w:val="18"/>
               </w:rPr>
-              <w:t>25 Custom Titles</w:t>
+              <w:t>26 Custom Titles</w:t>
             </w:r>
           </w:p>
         </w:tc>
@@ -1979,7 +1993,7 @@
                 <w:color w:val="10B981"/>
                 <w:sz w:val="18"/>
               </w:rPr>
-              <w:t>Live Across 25 Pages</w:t>
+              <w:t>Live Across 26 Pages</w:t>
             </w:r>
           </w:p>
         </w:tc>
@@ -2032,7 +2046,7 @@
                 <w:color w:val="1E293B"/>
                 <w:sz w:val="18"/>
               </w:rPr>
-              <w:t>25 Custom Descriptions</w:t>
+              <w:t>26 Custom Descriptions</w:t>
             </w:r>
           </w:p>
         </w:tc>
@@ -2058,7 +2072,7 @@
                 <w:color w:val="10B981"/>
                 <w:sz w:val="18"/>
               </w:rPr>
-              <w:t>Live Across 25 Pages</w:t>
+              <w:t>Live Across 26 Pages</w:t>
             </w:r>
           </w:p>
         </w:tc>
@@ -2190,7 +2204,7 @@
                 <w:color w:val="1E293B"/>
                 <w:sz w:val="18"/>
               </w:rPr>
-              <w:t>20 Dedicated Pages</w:t>
+              <w:t>21 Dedicated Pages</w:t>
             </w:r>
           </w:p>
         </w:tc>
@@ -2269,7 +2283,7 @@
                 <w:color w:val="1E293B"/>
                 <w:sz w:val="18"/>
               </w:rPr>
-              <w:t>270+ Structured Links</w:t>
+              <w:t>280+ Structured Links</w:t>
             </w:r>
           </w:p>
         </w:tc>
@@ -2295,7 +2309,7 @@
                 <w:color w:val="10B981"/>
                 <w:sz w:val="18"/>
               </w:rPr>
-              <w:t>Live Across 25 Pages</w:t>
+              <w:t>Live Across 26 Pages</w:t>
             </w:r>
           </w:p>
         </w:tc>
@@ -2769,7 +2783,7 @@
                 <w:color w:val="10B981"/>
                 <w:sz w:val="18"/>
               </w:rPr>
-              <w:t>Deployed Across 25 Pages</w:t>
+              <w:t>Deployed Across 26 Pages</w:t>
             </w:r>
           </w:p>
         </w:tc>

</xml_diff>